<commit_message>
Numbered superscript citations; epistemic labels removed from the paper
</commit_message>
<xml_diff>
--- a/projects/2026-10-apart-collusion-sprint/report/REPORT-APART.docx
+++ b/projects/2026-10-apart-collusion-sprint/report/REPORT-APART.docx
@@ -833,18 +833,7 @@
         <w:rPr>
           <w:rFonts w:ascii="Old Standard TT" w:cs="Old Standard TT" w:eastAsia="Old Standard TT" w:hAnsi="Old Standard TT"/>
         </w:rPr>
-        <w:t xml:space="preserve"> One structure in three settings. </w:t>
-      </w:r>
-      <w:r>
-        <w:rPr>
-          <w:rFonts w:ascii="Old Standard TT" w:cs="Old Standard TT" w:eastAsia="Old Standard TT" w:hAnsi="Old Standard TT"/>
-          <w:b/>
-          <w:bCs/>
-          <w:smallCaps/>
-          <w:sz w:val="18"/>
-          <w:szCs w:val="18"/>
-        </w:rPr>
-        <w:t xml:space="preserve">[INTERPRETATION]</w:t>
+        <w:t xml:space="preserve"> One structure in three settings.</w:t>
       </w:r>
     </w:p>
     <w:tbl>
@@ -1475,7 +1464,59 @@
         <w:rPr>
           <w:rFonts w:ascii="Old Standard TT" w:cs="Old Standard TT" w:eastAsia="Old Standard TT" w:hAnsi="Old Standard TT"/>
         </w:rPr>
-        <w:t xml:space="preserve">This is an old problem for regulators. After the California crisis of 2000 to 2001, the US Federal Energy Regulatory Commission (FERC) checked whether generators had declared units unavailable without cause. For one owner, staff found "no credible evidence" of withholding [S28]. For two sellers, FERC alleged "coordinated efforts to manipulate electricity prices" [S29]. The same record, a unit declared unavailable, can come from a fault, from one firm's strategy, or from a coalition. The market rules list "unexplained or unusual redeclarations of availability" as an indicator, not as proof [S30]. At San Bruno, a pipeline database copied an "erroneous material description" from a 1956 accounting voucher, and every later analysis relied on it [S34]. Three records that agree can share one wrong origin.</w:t>
+        <w:t xml:space="preserve">This is an old problem for regulators. After the California crisis of 2000 to 2001, the US Federal Energy Regulatory Commission (FERC) checked whether generators had declared units unavailable without cause. For one owner, staff found "no credible evidence" of withholding </w:t>
+      </w:r>
+      <w:r>
+        <w:rPr>
+          <w:rFonts w:ascii="Old Standard TT" w:cs="Old Standard TT" w:eastAsia="Old Standard TT" w:hAnsi="Old Standard TT"/>
+          <w:vertAlign w:val="superscript"/>
+        </w:rPr>
+        <w:t xml:space="preserve">1</w:t>
+      </w:r>
+      <w:r>
+        <w:rPr>
+          <w:rFonts w:ascii="Old Standard TT" w:cs="Old Standard TT" w:eastAsia="Old Standard TT" w:hAnsi="Old Standard TT"/>
+        </w:rPr>
+        <w:t xml:space="preserve">. For two sellers, FERC alleged "coordinated efforts to manipulate electricity prices" </w:t>
+      </w:r>
+      <w:r>
+        <w:rPr>
+          <w:rFonts w:ascii="Old Standard TT" w:cs="Old Standard TT" w:eastAsia="Old Standard TT" w:hAnsi="Old Standard TT"/>
+          <w:vertAlign w:val="superscript"/>
+        </w:rPr>
+        <w:t xml:space="preserve">2</w:t>
+      </w:r>
+      <w:r>
+        <w:rPr>
+          <w:rFonts w:ascii="Old Standard TT" w:cs="Old Standard TT" w:eastAsia="Old Standard TT" w:hAnsi="Old Standard TT"/>
+        </w:rPr>
+        <w:t xml:space="preserve">. The same record, a unit declared unavailable, can come from a fault, from one firm's strategy, or from a coalition. The market rules list "unexplained or unusual redeclarations of availability" as an indicator, not as proof </w:t>
+      </w:r>
+      <w:r>
+        <w:rPr>
+          <w:rFonts w:ascii="Old Standard TT" w:cs="Old Standard TT" w:eastAsia="Old Standard TT" w:hAnsi="Old Standard TT"/>
+          <w:vertAlign w:val="superscript"/>
+        </w:rPr>
+        <w:t xml:space="preserve">3</w:t>
+      </w:r>
+      <w:r>
+        <w:rPr>
+          <w:rFonts w:ascii="Old Standard TT" w:cs="Old Standard TT" w:eastAsia="Old Standard TT" w:hAnsi="Old Standard TT"/>
+        </w:rPr>
+        <w:t xml:space="preserve">. At San Bruno, a pipeline database copied an "erroneous material description" from a 1956 accounting voucher, and every later analysis relied on it </w:t>
+      </w:r>
+      <w:r>
+        <w:rPr>
+          <w:rFonts w:ascii="Old Standard TT" w:cs="Old Standard TT" w:eastAsia="Old Standard TT" w:hAnsi="Old Standard TT"/>
+          <w:vertAlign w:val="superscript"/>
+        </w:rPr>
+        <w:t xml:space="preserve">4</w:t>
+      </w:r>
+      <w:r>
+        <w:rPr>
+          <w:rFonts w:ascii="Old Standard TT" w:cs="Old Standard TT" w:eastAsia="Old Standard TT" w:hAnsi="Old Standard TT"/>
+        </w:rPr>
+        <w:t xml:space="preserve">. Three records that agree can share one wrong origin.</w:t>
       </w:r>
     </w:p>
     <w:p>
@@ -1536,7 +1577,59 @@
         <w:rPr>
           <w:rFonts w:ascii="Old Standard TT" w:cs="Old Standard TT" w:eastAsia="Old Standard TT" w:hAnsi="Old Standard TT"/>
         </w:rPr>
-        <w:t xml:space="preserve"> Antitrust law has worked on this question for a century. Parallel conduct alone does not show an agreement [S40]. One invitation that is known to reach all competitors, followed by uniform action, can [S41]. In the EU case Eturas [S42], a recipient of a collusive message can rebut participation by objecting or by acting against the message. Use of the same pricing software is not an agreement, but pooled data "might change" that [S46]. From these cases comes the idea of </w:t>
+        <w:t xml:space="preserve"> Antitrust law has worked on this question for a century. Parallel conduct alone does not show an agreement </w:t>
+      </w:r>
+      <w:r>
+        <w:rPr>
+          <w:rFonts w:ascii="Old Standard TT" w:cs="Old Standard TT" w:eastAsia="Old Standard TT" w:hAnsi="Old Standard TT"/>
+          <w:vertAlign w:val="superscript"/>
+        </w:rPr>
+        <w:t xml:space="preserve">5</w:t>
+      </w:r>
+      <w:r>
+        <w:rPr>
+          <w:rFonts w:ascii="Old Standard TT" w:cs="Old Standard TT" w:eastAsia="Old Standard TT" w:hAnsi="Old Standard TT"/>
+        </w:rPr>
+        <w:t xml:space="preserve">. One invitation that is known to reach all competitors, followed by uniform action, can </w:t>
+      </w:r>
+      <w:r>
+        <w:rPr>
+          <w:rFonts w:ascii="Old Standard TT" w:cs="Old Standard TT" w:eastAsia="Old Standard TT" w:hAnsi="Old Standard TT"/>
+          <w:vertAlign w:val="superscript"/>
+        </w:rPr>
+        <w:t xml:space="preserve">6</w:t>
+      </w:r>
+      <w:r>
+        <w:rPr>
+          <w:rFonts w:ascii="Old Standard TT" w:cs="Old Standard TT" w:eastAsia="Old Standard TT" w:hAnsi="Old Standard TT"/>
+        </w:rPr>
+        <w:t xml:space="preserve">. In the EU case Eturas </w:t>
+      </w:r>
+      <w:r>
+        <w:rPr>
+          <w:rFonts w:ascii="Old Standard TT" w:cs="Old Standard TT" w:eastAsia="Old Standard TT" w:hAnsi="Old Standard TT"/>
+          <w:vertAlign w:val="superscript"/>
+        </w:rPr>
+        <w:t xml:space="preserve">7</w:t>
+      </w:r>
+      <w:r>
+        <w:rPr>
+          <w:rFonts w:ascii="Old Standard TT" w:cs="Old Standard TT" w:eastAsia="Old Standard TT" w:hAnsi="Old Standard TT"/>
+        </w:rPr>
+        <w:t xml:space="preserve">, a recipient of a collusive message can rebut participation by objecting or by acting against the message. Use of the same pricing software is not an agreement, but pooled data "might change" that </w:t>
+      </w:r>
+      <w:r>
+        <w:rPr>
+          <w:rFonts w:ascii="Old Standard TT" w:cs="Old Standard TT" w:eastAsia="Old Standard TT" w:hAnsi="Old Standard TT"/>
+          <w:vertAlign w:val="superscript"/>
+        </w:rPr>
+        <w:t xml:space="preserve">8</w:t>
+      </w:r>
+      <w:r>
+        <w:rPr>
+          <w:rFonts w:ascii="Old Standard TT" w:cs="Old Standard TT" w:eastAsia="Old Standard TT" w:hAnsi="Old Standard TT"/>
+        </w:rPr>
+        <w:t xml:space="preserve">. From these cases comes the idea of </w:t>
       </w:r>
       <w:r>
         <w:rPr>
@@ -1550,7 +1643,33 @@
         <w:rPr>
           <w:rFonts w:ascii="Old Standard TT" w:cs="Old Standard TT" w:eastAsia="Old Standard TT" w:hAnsi="Old Standard TT"/>
         </w:rPr>
-        <w:t xml:space="preserve">: evidence that is more probable under collusion than under parallel conduct [S2]. The sprint reading list for question 2.3 includes an antitrust article on plus factors [S2]. I do not claim that the idea is new. Its limit is that a legal standard sets a burden of proof; it does not give a detector a threshold.</w:t>
+        <w:t xml:space="preserve">: evidence that is more probable under collusion than under parallel conduct </w:t>
+      </w:r>
+      <w:r>
+        <w:rPr>
+          <w:rFonts w:ascii="Old Standard TT" w:cs="Old Standard TT" w:eastAsia="Old Standard TT" w:hAnsi="Old Standard TT"/>
+          <w:vertAlign w:val="superscript"/>
+        </w:rPr>
+        <w:t xml:space="preserve">9</w:t>
+      </w:r>
+      <w:r>
+        <w:rPr>
+          <w:rFonts w:ascii="Old Standard TT" w:cs="Old Standard TT" w:eastAsia="Old Standard TT" w:hAnsi="Old Standard TT"/>
+        </w:rPr>
+        <w:t xml:space="preserve">. The sprint reading list for question 2.3 includes an antitrust article on plus factors </w:t>
+      </w:r>
+      <w:r>
+        <w:rPr>
+          <w:rFonts w:ascii="Old Standard TT" w:cs="Old Standard TT" w:eastAsia="Old Standard TT" w:hAnsi="Old Standard TT"/>
+          <w:vertAlign w:val="superscript"/>
+        </w:rPr>
+        <w:t xml:space="preserve">9</w:t>
+      </w:r>
+      <w:r>
+        <w:rPr>
+          <w:rFonts w:ascii="Old Standard TT" w:cs="Old Standard TT" w:eastAsia="Old Standard TT" w:hAnsi="Old Standard TT"/>
+        </w:rPr>
+        <w:t xml:space="preserve">. I do not claim that the idea is new. Its limit is that a legal standard sets a burden of proof; it does not give a detector a threshold.</w:t>
       </w:r>
     </w:p>
     <w:p>
@@ -1586,7 +1705,20 @@
         <w:rPr>
           <w:rFonts w:ascii="Old Standard TT" w:cs="Old Standard TT" w:eastAsia="Old Standard TT" w:hAnsi="Old Standard TT"/>
         </w:rPr>
-        <w:t xml:space="preserve">, a second agent copies the first because the first agent's choice is evidence [R6]. In </w:t>
+        <w:t xml:space="preserve">, a second agent copies the first because the first agent's choice is evidence </w:t>
+      </w:r>
+      <w:r>
+        <w:rPr>
+          <w:rFonts w:ascii="Old Standard TT" w:cs="Old Standard TT" w:eastAsia="Old Standard TT" w:hAnsi="Old Standard TT"/>
+          <w:vertAlign w:val="superscript"/>
+        </w:rPr>
+        <w:t xml:space="preserve">10</w:t>
+      </w:r>
+      <w:r>
+        <w:rPr>
+          <w:rFonts w:ascii="Old Standard TT" w:cs="Old Standard TT" w:eastAsia="Old Standard TT" w:hAnsi="Old Standard TT"/>
+        </w:rPr>
+        <w:t xml:space="preserve">. In </w:t>
       </w:r>
       <w:r>
         <w:rPr>
@@ -1600,7 +1732,20 @@
         <w:rPr>
           <w:rFonts w:ascii="Old Standard TT" w:cs="Old Standard TT" w:eastAsia="Old Standard TT" w:hAnsi="Old Standard TT"/>
         </w:rPr>
-        <w:t xml:space="preserve">, a message from a sender with its own interest carries little information [R7]. In </w:t>
+        <w:t xml:space="preserve">, a message from a sender with its own interest carries little information </w:t>
+      </w:r>
+      <w:r>
+        <w:rPr>
+          <w:rFonts w:ascii="Old Standard TT" w:cs="Old Standard TT" w:eastAsia="Old Standard TT" w:hAnsi="Old Standard TT"/>
+          <w:vertAlign w:val="superscript"/>
+        </w:rPr>
+        <w:t xml:space="preserve">11</w:t>
+      </w:r>
+      <w:r>
+        <w:rPr>
+          <w:rFonts w:ascii="Old Standard TT" w:cs="Old Standard TT" w:eastAsia="Old Standard TT" w:hAnsi="Old Standard TT"/>
+        </w:rPr>
+        <w:t xml:space="preserve">. In </w:t>
       </w:r>
       <w:r>
         <w:rPr>
@@ -1614,7 +1759,20 @@
         <w:rPr>
           <w:rFonts w:ascii="Old Standard TT" w:cs="Old Standard TT" w:eastAsia="Old Standard TT" w:hAnsi="Old Standard TT"/>
         </w:rPr>
-        <w:t xml:space="preserve">, a sender who selects which true facts to show can move a rational receiver to a false belief [R8]. </w:t>
+        <w:t xml:space="preserve">, a sender who selects which true facts to show can move a rational receiver to a false belief </w:t>
+      </w:r>
+      <w:r>
+        <w:rPr>
+          <w:rFonts w:ascii="Old Standard TT" w:cs="Old Standard TT" w:eastAsia="Old Standard TT" w:hAnsi="Old Standard TT"/>
+          <w:vertAlign w:val="superscript"/>
+        </w:rPr>
+        <w:t xml:space="preserve">12</w:t>
+      </w:r>
+      <w:r>
+        <w:rPr>
+          <w:rFonts w:ascii="Old Standard TT" w:cs="Old Standard TT" w:eastAsia="Old Standard TT" w:hAnsi="Old Standard TT"/>
+        </w:rPr>
+        <w:t xml:space="preserve">. </w:t>
       </w:r>
       <w:r>
         <w:rPr>
@@ -1628,7 +1786,20 @@
         <w:rPr>
           <w:rFonts w:ascii="Old Standard TT" w:cs="Old Standard TT" w:eastAsia="Old Standard TT" w:hAnsi="Old Standard TT"/>
         </w:rPr>
-        <w:t xml:space="preserve"> in multi-agent debate shows the cascade effect in language models [R15].</w:t>
+        <w:t xml:space="preserve"> in multi-agent debate shows the cascade effect in language models </w:t>
+      </w:r>
+      <w:r>
+        <w:rPr>
+          <w:rFonts w:ascii="Old Standard TT" w:cs="Old Standard TT" w:eastAsia="Old Standard TT" w:hAnsi="Old Standard TT"/>
+          <w:vertAlign w:val="superscript"/>
+        </w:rPr>
+        <w:t xml:space="preserve">13</w:t>
+      </w:r>
+      <w:r>
+        <w:rPr>
+          <w:rFonts w:ascii="Old Standard TT" w:cs="Old Standard TT" w:eastAsia="Old Standard TT" w:hAnsi="Old Standard TT"/>
+        </w:rPr>
+        <w:t xml:space="preserve">.</w:t>
       </w:r>
     </w:p>
     <w:p>
@@ -1664,7 +1835,20 @@
         <w:rPr>
           <w:rFonts w:ascii="Old Standard TT" w:cs="Old Standard TT" w:eastAsia="Old Standard TT" w:hAnsi="Old Standard TT"/>
         </w:rPr>
-        <w:t xml:space="preserve"> [R12] defines collusion among AI agents and studies messages that are hidden from the monitor. </w:t>
+        <w:t xml:space="preserve"> </w:t>
+      </w:r>
+      <w:r>
+        <w:rPr>
+          <w:rFonts w:ascii="Old Standard TT" w:cs="Old Standard TT" w:eastAsia="Old Standard TT" w:hAnsi="Old Standard TT"/>
+          <w:vertAlign w:val="superscript"/>
+        </w:rPr>
+        <w:t xml:space="preserve">14</w:t>
+      </w:r>
+      <w:r>
+        <w:rPr>
+          <w:rFonts w:ascii="Old Standard TT" w:cs="Old Standard TT" w:eastAsia="Old Standard TT" w:hAnsi="Old Standard TT"/>
+        </w:rPr>
+        <w:t xml:space="preserve"> defines collusion among AI agents and studies messages that are hidden from the monitor. </w:t>
       </w:r>
       <w:r>
         <w:rPr>
@@ -1678,7 +1862,20 @@
         <w:rPr>
           <w:rFonts w:ascii="Old Standard TT" w:cs="Old Standard TT" w:eastAsia="Old Standard TT" w:hAnsi="Old Standard TT"/>
         </w:rPr>
-        <w:t xml:space="preserve"> [S1] audits collusion in cooperative multi-agent tasks and reports "collusion on paper": agents agree in text to collude, but their actions do not follow. </w:t>
+        <w:t xml:space="preserve"> </w:t>
+      </w:r>
+      <w:r>
+        <w:rPr>
+          <w:rFonts w:ascii="Old Standard TT" w:cs="Old Standard TT" w:eastAsia="Old Standard TT" w:hAnsi="Old Standard TT"/>
+          <w:vertAlign w:val="superscript"/>
+        </w:rPr>
+        <w:t xml:space="preserve">15</w:t>
+      </w:r>
+      <w:r>
+        <w:rPr>
+          <w:rFonts w:ascii="Old Standard TT" w:cs="Old Standard TT" w:eastAsia="Old Standard TT" w:hAnsi="Old Standard TT"/>
+        </w:rPr>
+        <w:t xml:space="preserve"> audits collusion in cooperative multi-agent tasks and reports "collusion on paper": agents agree in text to collude, but their actions do not follow. </w:t>
       </w:r>
       <w:r>
         <w:rPr>
@@ -1692,7 +1889,20 @@
         <w:rPr>
           <w:rFonts w:ascii="Old Standard TT" w:cs="Old Standard TT" w:eastAsia="Old Standard TT" w:hAnsi="Old Standard TT"/>
         </w:rPr>
-        <w:t xml:space="preserve"> [R14] shows that agents can release true pieces of evidence that together cause a false belief. </w:t>
+        <w:t xml:space="preserve"> </w:t>
+      </w:r>
+      <w:r>
+        <w:rPr>
+          <w:rFonts w:ascii="Old Standard TT" w:cs="Old Standard TT" w:eastAsia="Old Standard TT" w:hAnsi="Old Standard TT"/>
+          <w:vertAlign w:val="superscript"/>
+        </w:rPr>
+        <w:t xml:space="preserve">16</w:t>
+      </w:r>
+      <w:r>
+        <w:rPr>
+          <w:rFonts w:ascii="Old Standard TT" w:cs="Old Standard TT" w:eastAsia="Old Standard TT" w:hAnsi="Old Standard TT"/>
+        </w:rPr>
+        <w:t xml:space="preserve"> shows that agents can release true pieces of evidence that together cause a false belief. </w:t>
       </w:r>
       <w:r>
         <w:rPr>
@@ -1706,7 +1916,20 @@
         <w:rPr>
           <w:rFonts w:ascii="Old Standard TT" w:cs="Old Standard TT" w:eastAsia="Old Standard TT" w:hAnsi="Old Standard TT"/>
         </w:rPr>
-        <w:t xml:space="preserve"> [R17] detects collusion from the internal activations of a model. </w:t>
+        <w:t xml:space="preserve"> </w:t>
+      </w:r>
+      <w:r>
+        <w:rPr>
+          <w:rFonts w:ascii="Old Standard TT" w:cs="Old Standard TT" w:eastAsia="Old Standard TT" w:hAnsi="Old Standard TT"/>
+          <w:vertAlign w:val="superscript"/>
+        </w:rPr>
+        <w:t xml:space="preserve">17</w:t>
+      </w:r>
+      <w:r>
+        <w:rPr>
+          <w:rFonts w:ascii="Old Standard TT" w:cs="Old Standard TT" w:eastAsia="Old Standard TT" w:hAnsi="Old Standard TT"/>
+        </w:rPr>
+        <w:t xml:space="preserve"> detects collusion from the internal activations of a model. </w:t>
       </w:r>
       <w:r>
         <w:rPr>
@@ -1720,7 +1943,20 @@
         <w:rPr>
           <w:rFonts w:ascii="Old Standard TT" w:cs="Old Standard TT" w:eastAsia="Old Standard TT" w:hAnsi="Old Standard TT"/>
         </w:rPr>
-        <w:t xml:space="preserve"> [R11] studies oversight when some agents cannot be trusted. The decider in my game is that oversight step, and the auditor acts after it.</w:t>
+        <w:t xml:space="preserve"> </w:t>
+      </w:r>
+      <w:r>
+        <w:rPr>
+          <w:rFonts w:ascii="Old Standard TT" w:cs="Old Standard TT" w:eastAsia="Old Standard TT" w:hAnsi="Old Standard TT"/>
+          <w:vertAlign w:val="superscript"/>
+        </w:rPr>
+        <w:t xml:space="preserve">18</w:t>
+      </w:r>
+      <w:r>
+        <w:rPr>
+          <w:rFonts w:ascii="Old Standard TT" w:cs="Old Standard TT" w:eastAsia="Old Standard TT" w:hAnsi="Old Standard TT"/>
+        </w:rPr>
+        <w:t xml:space="preserve"> studies oversight when some agents cannot be trusted. The decider in my game is that oversight step, and the auditor acts after it.</w:t>
       </w:r>
     </w:p>
     <w:p>
@@ -1742,7 +1978,20 @@
         <w:rPr>
           <w:rFonts w:ascii="Old Standard TT" w:cs="Old Standard TT" w:eastAsia="Old Standard TT" w:hAnsi="Old Standard TT"/>
         </w:rPr>
-        <w:t xml:space="preserve"> Each of these works describes one cause of agreement. A deployed auditor meets all of them at once, in one record, with no label. The legal cases show what happens then: FERC staff cleared one owner and charged two sellers on the same kind of record [S28], [S29]. The question for an AI auditor is the same. It must find the features of a record that separate collusion from the four innocent causes, and from talk that changes nothing.</w:t>
+        <w:t xml:space="preserve"> Each of these works describes one cause of agreement. A deployed auditor meets all of them at once, in one record, with no label. The legal cases show what happens then: FERC staff cleared one owner and charged two sellers on the same kind of record </w:t>
+      </w:r>
+      <w:r>
+        <w:rPr>
+          <w:rFonts w:ascii="Old Standard TT" w:cs="Old Standard TT" w:eastAsia="Old Standard TT" w:hAnsi="Old Standard TT"/>
+          <w:vertAlign w:val="superscript"/>
+        </w:rPr>
+        <w:t xml:space="preserve">1, 2</w:t>
+      </w:r>
+      <w:r>
+        <w:rPr>
+          <w:rFonts w:ascii="Old Standard TT" w:cs="Old Standard TT" w:eastAsia="Old Standard TT" w:hAnsi="Old Standard TT"/>
+        </w:rPr>
+        <w:t xml:space="preserve">. The question for an AI auditor is the same. It must find the features of a record that separate collusion from the four innocent causes, and from talk that changes nothing.</w:t>
       </w:r>
     </w:p>
     <w:p>
@@ -1923,7 +2172,20 @@
         <w:rPr>
           <w:rFonts w:ascii="Old Standard TT" w:cs="Old Standard TT" w:eastAsia="Old Standard TT" w:hAnsi="Old Standard TT"/>
         </w:rPr>
-        <w:t xml:space="preserve"> Reviewers with the same incentive act in the same way, without coordination. In antitrust law, parallel conduct alone is not illegal [S2].</w:t>
+        <w:t xml:space="preserve"> Reviewers with the same incentive act in the same way, without coordination. In antitrust law, parallel conduct alone is not illegal </w:t>
+      </w:r>
+      <w:r>
+        <w:rPr>
+          <w:rFonts w:ascii="Old Standard TT" w:cs="Old Standard TT" w:eastAsia="Old Standard TT" w:hAnsi="Old Standard TT"/>
+          <w:vertAlign w:val="superscript"/>
+        </w:rPr>
+        <w:t xml:space="preserve">9</w:t>
+      </w:r>
+      <w:r>
+        <w:rPr>
+          <w:rFonts w:ascii="Old Standard TT" w:cs="Old Standard TT" w:eastAsia="Old Standard TT" w:hAnsi="Old Standard TT"/>
+        </w:rPr>
+        <w:t xml:space="preserve">.</w:t>
       </w:r>
     </w:p>
     <w:p>
@@ -7330,19 +7592,8 @@
       <w:r>
         <w:rPr>
           <w:rFonts w:ascii="Old Standard TT" w:cs="Old Standard TT" w:eastAsia="Old Standard TT" w:hAnsi="Old Standard TT"/>
-          <w:b/>
-          <w:bCs/>
-          <w:smallCaps/>
-          <w:sz w:val="18"/>
-          <w:szCs w:val="18"/>
-        </w:rPr>
-        <w:t xml:space="preserve">[FINDING]</w:t>
-      </w:r>
-      <w:r>
-        <w:rPr>
-          <w:rFonts w:ascii="Old Standard TT" w:cs="Old Standard TT" w:eastAsia="Old Standard TT" w:hAnsi="Old Standard TT"/>
-        </w:rPr>
-        <w:t xml:space="preserve"> In no model did the private channel increase false approvals. In GPT-5.6 Terra and DeepSeek Flash it decreased them by 0.222, and the interval excludes zero. In the DeepSeek chat run, the two invalid approvals in E1 are the same two cases as in E0, which has no channel.</w:t>
+        </w:rPr>
+        <w:t xml:space="preserve">In no model did the private channel increase false approvals. In GPT-5.6 Terra and DeepSeek Flash it decreased them by 0.222, and the interval excludes zero. In the DeepSeek chat run, the two invalid approvals in E1 are the same two cases as in E0, which has no channel.</w:t>
       </w:r>
     </w:p>
     <w:p>
@@ -7355,19 +7606,8 @@
       <w:r>
         <w:rPr>
           <w:rFonts w:ascii="Old Standard TT" w:cs="Old Standard TT" w:eastAsia="Old Standard TT" w:hAnsi="Old Standard TT"/>
-          <w:b/>
-          <w:bCs/>
-          <w:smallCaps/>
-          <w:sz w:val="18"/>
-          <w:szCs w:val="18"/>
-        </w:rPr>
-        <w:t xml:space="preserve">[FINDING]</w:t>
-      </w:r>
-      <w:r>
-        <w:rPr>
-          <w:rFonts w:ascii="Old Standard TT" w:cs="Old Standard TT" w:eastAsia="Old Standard TT" w:hAnsi="Old Standard TT"/>
-        </w:rPr>
-        <w:t xml:space="preserve"> Harm from a shared incentive alone depended on the model. The parallel-conduct contrast ranged from 0.000 (Claude Haiku, Claude Sonnet) to 0.389 (GPT-5.6 Luna, DeepSeek V4 Pro). The interval excludes zero for four of the seven models.</w:t>
+        </w:rPr>
+        <w:t xml:space="preserve">Harm from a shared incentive alone depended on the model. The parallel-conduct contrast ranged from 0.000 (Claude Haiku, Claude Sonnet) to 0.389 (GPT-5.6 Luna, DeepSeek V4 Pro). The interval excludes zero for four of the seven models.</w:t>
       </w:r>
     </w:p>
     <w:p>
@@ -7380,19 +7620,8 @@
       <w:r>
         <w:rPr>
           <w:rFonts w:ascii="Old Standard TT" w:cs="Old Standard TT" w:eastAsia="Old Standard TT" w:hAnsi="Old Standard TT"/>
-          <w:b/>
-          <w:bCs/>
-          <w:smallCaps/>
-          <w:sz w:val="18"/>
-          <w:szCs w:val="18"/>
-        </w:rPr>
-        <w:t xml:space="preserve">[FINDING]</w:t>
-      </w:r>
-      <w:r>
-        <w:rPr>
-          <w:rFonts w:ascii="Old Standard TT" w:cs="Old Standard TT" w:eastAsia="Old Standard TT" w:hAnsi="Old Standard TT"/>
-        </w:rPr>
-        <w:t xml:space="preserve"> The shared-source contrast was 0.111 or less in every model, and no interval excluded zero.</w:t>
+        </w:rPr>
+        <w:t xml:space="preserve">The shared-source contrast was 0.111 or less in every model, and no interval excluded zero.</w:t>
       </w:r>
     </w:p>
     <w:p>
@@ -8528,19 +8757,8 @@
       <w:r>
         <w:rPr>
           <w:rFonts w:ascii="Old Standard TT" w:cs="Old Standard TT" w:eastAsia="Old Standard TT" w:hAnsi="Old Standard TT"/>
-          <w:b/>
-          <w:bCs/>
-          <w:smallCaps/>
-          <w:sz w:val="18"/>
-          <w:szCs w:val="18"/>
-        </w:rPr>
-        <w:t xml:space="preserve">[FINDING]</w:t>
-      </w:r>
-      <w:r>
-        <w:rPr>
-          <w:rFonts w:ascii="Old Standard TT" w:cs="Old Standard TT" w:eastAsia="Old Standard TT" w:hAnsi="Old Standard TT"/>
-        </w:rPr>
-        <w:t xml:space="preserve"> For DeepSeek chat, when both reviewers gave the same private reply, the reply matched both endorsements in only 8 of 20 cases. "Matched" means: agreement followed by two endorsements, or refusal followed by fewer than two. The one DeepSeek chat trajectory with all three parts of collusion (F11-F, seed 1) had the same invalid approval in E0. The coordination did not cause the harm in that case.</w:t>
+        </w:rPr>
+        <w:t xml:space="preserve">For DeepSeek chat, when both reviewers gave the same private reply, the reply matched both endorsements in only 8 of 20 cases. "Matched" means: agreement followed by two endorsements, or refusal followed by fewer than two. The one DeepSeek chat trajectory with all three parts of collusion (F11-F, seed 1) had the same invalid approval in E0. The coordination did not cause the harm in that case.</w:t>
       </w:r>
     </w:p>
     <w:p>
@@ -8553,19 +8771,8 @@
       <w:r>
         <w:rPr>
           <w:rFonts w:ascii="Old Standard TT" w:cs="Old Standard TT" w:eastAsia="Old Standard TT" w:hAnsi="Old Standard TT"/>
-          <w:b/>
-          <w:bCs/>
-          <w:smallCaps/>
-          <w:sz w:val="18"/>
-          <w:szCs w:val="18"/>
-        </w:rPr>
-        <w:t xml:space="preserve">[FINDING]</w:t>
-      </w:r>
-      <w:r>
-        <w:rPr>
-          <w:rFonts w:ascii="Old Standard TT" w:cs="Old Standard TT" w:eastAsia="Old Standard TT" w:hAnsi="Old Standard TT"/>
-        </w:rPr>
-        <w:t xml:space="preserve"> Of 108 hand-read collusion-opportunity trajectories, two had all three parts of collusion: DeepSeek chat F11-F seed 1 and GPT-5.6 Terra F08-F seed 2. In the DeepSeek case, the matched E0 trajectory had the same invalid approval. In the Terra case, the matched E0 trajectory was rejected, so the plan changed the action. The deployable auditor S4d flagged the Terra case, with a score of 0.5, because the endorsements differed from the matched trajectory. The auditor S3, without the matched trajectory, scored it 0.3 and did not flag it.</w:t>
+        </w:rPr>
+        <w:t xml:space="preserve">Of 108 hand-read collusion-opportunity trajectories, two had all three parts of collusion: DeepSeek chat F11-F seed 1 and GPT-5.6 Terra F08-F seed 2. In the DeepSeek case, the matched E0 trajectory had the same invalid approval. In the Terra case, the matched E0 trajectory was rejected, so the plan changed the action. The deployable auditor S4d flagged the Terra case, with a score of 0.5, because the endorsements differed from the matched trajectory. The auditor S3, without the matched trajectory, scored it 0.3 and did not flag it.</w:t>
       </w:r>
     </w:p>
     <w:p>
@@ -8578,19 +8785,8 @@
       <w:r>
         <w:rPr>
           <w:rFonts w:ascii="Old Standard TT" w:cs="Old Standard TT" w:eastAsia="Old Standard TT" w:hAnsi="Old Standard TT"/>
-          <w:b/>
-          <w:bCs/>
-          <w:smallCaps/>
-          <w:sz w:val="18"/>
-          <w:szCs w:val="18"/>
-        </w:rPr>
-        <w:t xml:space="preserve">[FINDING]</w:t>
-      </w:r>
-      <w:r>
-        <w:rPr>
-          <w:rFonts w:ascii="Old Standard TT" w:cs="Old Standard TT" w:eastAsia="Old Standard TT" w:hAnsi="Old Standard TT"/>
-        </w:rPr>
-        <w:t xml:space="preserve"> The feature "endorsements differ from the matched trajectory" is weak on its own. It fired in 6 to 24 of 36 E1 trajectories per model, because the models' answers vary between regimes. Together with an invalid approval, it fired in 4 trajectories across all models (GPT-5.6 Luna 1, GPT-5.6 Terra 1, DeepSeek V4 Pro 2). The Terra case is the one of these with a plan and agreement.</w:t>
+        </w:rPr>
+        <w:t xml:space="preserve">The feature "endorsements differ from the matched trajectory" is weak on its own. It fired in 6 to 24 of 36 E1 trajectories per model, because the models' answers vary between regimes. Together with an invalid approval, it fired in 4 trajectories across all models (GPT-5.6 Luna 1, GPT-5.6 Terra 1, DeepSeek V4 Pro 2). The Terra case is the one of these with a plan and agreement.</w:t>
       </w:r>
     </w:p>
     <w:p>
@@ -8603,19 +8799,8 @@
       <w:r>
         <w:rPr>
           <w:rFonts w:ascii="Old Standard TT" w:cs="Old Standard TT" w:eastAsia="Old Standard TT" w:hAnsi="Old Standard TT"/>
-          <w:b/>
-          <w:bCs/>
-          <w:smallCaps/>
-          <w:sz w:val="18"/>
-          <w:szCs w:val="18"/>
-        </w:rPr>
-        <w:t xml:space="preserve">[FINDING]</w:t>
-      </w:r>
-      <w:r>
-        <w:rPr>
-          <w:rFonts w:ascii="Old Standard TT" w:cs="Old Standard TT" w:eastAsia="Old Standard TT" w:hAnsi="Old Standard TT"/>
-        </w:rPr>
-        <w:t xml:space="preserve"> Private messages also reduced harm. In GPT-5.6 Terra, five false claims that E0 approved were rejected or deferred in E1; in each, a reviewer cited a contrary item. In DeepSeek Flash, all four E0 invalid approvals became defer or reject in E1. In two Flash trajectories, both reviewers wrote that they would approve regardless of the evidence, and then both rejected.</w:t>
+        </w:rPr>
+        <w:t xml:space="preserve">Private messages also reduced harm. In GPT-5.6 Terra, five false claims that E0 approved were rejected or deferred in E1; in each, a reviewer cited a contrary item. In DeepSeek Flash, all four E0 invalid approvals became defer or reject in E1. In two Flash trajectories, both reviewers wrote that they would approve regardless of the evidence, and then both rejected.</w:t>
       </w:r>
     </w:p>
     <w:p>
@@ -8628,19 +8813,8 @@
       <w:r>
         <w:rPr>
           <w:rFonts w:ascii="Old Standard TT" w:cs="Old Standard TT" w:eastAsia="Old Standard TT" w:hAnsi="Old Standard TT"/>
-          <w:b/>
-          <w:bCs/>
-          <w:smallCaps/>
-          <w:sz w:val="18"/>
-          <w:szCs w:val="18"/>
-        </w:rPr>
-        <w:t xml:space="preserve">[FINDING]</w:t>
-      </w:r>
-      <w:r>
-        <w:rPr>
-          <w:rFonts w:ascii="Old Standard TT" w:cs="Old Standard TT" w:eastAsia="Old Standard TT" w:hAnsi="Old Standard TT"/>
-        </w:rPr>
-        <w:t xml:space="preserve"> In regime F, every reply to the injected plan was a refusal. The number of replies differed by model (Table 4).</w:t>
+        </w:rPr>
+        <w:t xml:space="preserve">In regime F, every reply to the injected plan was a refusal. The number of replies differed by model (Table 4).</w:t>
       </w:r>
     </w:p>
     <w:p>
@@ -9773,127 +9947,66 @@
       <w:r>
         <w:rPr>
           <w:rFonts w:ascii="Old Standard TT" w:cs="Old Standard TT" w:eastAsia="Old Standard TT" w:hAnsi="Old Standard TT"/>
+        </w:rPr>
+        <w:t xml:space="preserve">The keyword rule missed almost all real plans. The language models reworded their plans, so the keywords did not match. S3 flagged 0.03 or less of E1 in every model.</w:t>
+      </w:r>
+    </w:p>
+    <w:p>
+      <w:pPr>
+        <w:spacing w:after="120"/>
+        <w:rPr>
+          <w:rFonts w:ascii="Old Standard TT" w:cs="Old Standard TT" w:eastAsia="Old Standard TT" w:hAnsi="Old Standard TT"/>
+        </w:rPr>
+      </w:pPr>
+      <w:r>
+        <w:rPr>
+          <w:rFonts w:ascii="Old Standard TT" w:cs="Old Standard TT" w:eastAsia="Old Standard TT" w:hAnsi="Old Standard TT"/>
+        </w:rPr>
+        <w:t xml:space="preserve">A real auditor cannot compute the matched-trajectory feature. Without it, S4d gives the same pooled false-positive rates in every model (within 0.005). It scores the one real case 0.40 (0.5 minus the 0.1 that the feature added) and does not flag it. A version of S4d without the matched trajectory catches nothing real and removes nothing innocent (exploratory; not preregistered).</w:t>
+      </w:r>
+    </w:p>
+    <w:p>
+      <w:pPr>
+        <w:spacing w:after="120"/>
+        <w:rPr>
+          <w:rFonts w:ascii="Old Standard TT" w:cs="Old Standard TT" w:eastAsia="Old Standard TT" w:hAnsi="Old Standard TT"/>
+        </w:rPr>
+      </w:pPr>
+      <w:r>
+        <w:rPr>
+          <w:rFonts w:ascii="Old Standard TT" w:cs="Old Standard TT" w:eastAsia="Old Standard TT" w:hAnsi="Old Standard TT"/>
+        </w:rPr>
+        <w:t xml:space="preserve">Provenance data did not reduce false positives by the preregistered 0.10 in any model. The reductions were 0.000 to 0.017. The rule auditors had few false positives in B, C, D, and E0, so the provenance discounts had little to correct.</w:t>
+      </w:r>
+    </w:p>
+    <w:p>
+      <w:pPr>
+        <w:spacing w:after="120"/>
+        <w:rPr>
+          <w:rFonts w:ascii="Old Standard TT" w:cs="Old Standard TT" w:eastAsia="Old Standard TT" w:hAnsi="Old Standard TT"/>
+        </w:rPr>
+      </w:pPr>
+      <w:r>
+        <w:rPr>
+          <w:rFonts w:ascii="Old Standard TT" w:cs="Old Standard TT" w:eastAsia="Old Standard TT" w:hAnsi="Old Standard TT"/>
+        </w:rPr>
+        <w:t xml:space="preserve">The LLM judge's flags on the injected plan followed the reviewers' replies. It flagged 36 of 36 where no reviewer answered (DeepSeek V4 Pro) and 32 of 36 where few answered (DeepSeek chat). Under S1 it flagged 36 of 36 where only one reviewer refused (DeepSeek Flash); under S3, 8 of 36. Where both reviewers refused in writing, it flagged 11 of 36 (GPT-5.6 Terra), 1 (Claude Haiku), 1 (GPT-5.6 Luna), and 0 (Claude Sonnet). Its stated reasons say that the refusals lowered its score. One refusal was not enough. The 11 Terra trajectories it flagged had replies of the form "I will assess the evidence independently" rather than an explicit refusal.</w:t>
+      </w:r>
+    </w:p>
+    <w:p>
+      <w:pPr>
+        <w:spacing w:after="120"/>
+        <w:rPr>
+          <w:rFonts w:ascii="Old Standard TT" w:cs="Old Standard TT" w:eastAsia="Old Standard TT" w:hAnsi="Old Standard TT"/>
+        </w:rPr>
+      </w:pPr>
+      <w:r>
+        <w:rPr>
+          <w:rFonts w:ascii="Old Standard TT" w:cs="Old Standard TT" w:eastAsia="Old Standard TT" w:hAnsi="Old Standard TT"/>
           <w:b/>
           <w:bCs/>
-          <w:smallCaps/>
-          <w:sz w:val="18"/>
-          <w:szCs w:val="18"/>
-        </w:rPr>
-        <w:t xml:space="preserve">[FINDING]</w:t>
-      </w:r>
-      <w:r>
-        <w:rPr>
-          <w:rFonts w:ascii="Old Standard TT" w:cs="Old Standard TT" w:eastAsia="Old Standard TT" w:hAnsi="Old Standard TT"/>
-        </w:rPr>
-        <w:t xml:space="preserve"> The keyword rule missed almost all real plans. The language models reworded their plans, so the keywords did not match. S3 flagged 0.03 or less of E1 in every model.</w:t>
-      </w:r>
-    </w:p>
-    <w:p>
-      <w:pPr>
-        <w:spacing w:after="120"/>
-        <w:rPr>
-          <w:rFonts w:ascii="Old Standard TT" w:cs="Old Standard TT" w:eastAsia="Old Standard TT" w:hAnsi="Old Standard TT"/>
-        </w:rPr>
-      </w:pPr>
-      <w:r>
-        <w:rPr>
-          <w:rFonts w:ascii="Old Standard TT" w:cs="Old Standard TT" w:eastAsia="Old Standard TT" w:hAnsi="Old Standard TT"/>
-        </w:rPr>
-        <w:t xml:space="preserve">A real auditor cannot compute the matched-trajectory feature. </w:t>
-      </w:r>
-      <w:r>
-        <w:rPr>
-          <w:rFonts w:ascii="Old Standard TT" w:cs="Old Standard TT" w:eastAsia="Old Standard TT" w:hAnsi="Old Standard TT"/>
-          <w:b/>
-          <w:bCs/>
-          <w:smallCaps/>
-          <w:sz w:val="18"/>
-          <w:szCs w:val="18"/>
-        </w:rPr>
-        <w:t xml:space="preserve">[FINDING]</w:t>
-      </w:r>
-      <w:r>
-        <w:rPr>
-          <w:rFonts w:ascii="Old Standard TT" w:cs="Old Standard TT" w:eastAsia="Old Standard TT" w:hAnsi="Old Standard TT"/>
-        </w:rPr>
-        <w:t xml:space="preserve"> Without it, S4d gives the same pooled false-positive rates in every model (within 0.005). It scores the one real case 0.40 (0.5 minus the 0.1 that the feature added) and does not flag it. A version of S4d without the matched trajectory catches nothing real and removes nothing innocent (exploratory; not preregistered).</w:t>
-      </w:r>
-    </w:p>
-    <w:p>
-      <w:pPr>
-        <w:spacing w:after="120"/>
-        <w:rPr>
-          <w:rFonts w:ascii="Old Standard TT" w:cs="Old Standard TT" w:eastAsia="Old Standard TT" w:hAnsi="Old Standard TT"/>
-        </w:rPr>
-      </w:pPr>
-      <w:r>
-        <w:rPr>
-          <w:rFonts w:ascii="Old Standard TT" w:cs="Old Standard TT" w:eastAsia="Old Standard TT" w:hAnsi="Old Standard TT"/>
-          <w:b/>
-          <w:bCs/>
-          <w:smallCaps/>
-          <w:sz w:val="18"/>
-          <w:szCs w:val="18"/>
-        </w:rPr>
-        <w:t xml:space="preserve">[FINDING]</w:t>
-      </w:r>
-      <w:r>
-        <w:rPr>
-          <w:rFonts w:ascii="Old Standard TT" w:cs="Old Standard TT" w:eastAsia="Old Standard TT" w:hAnsi="Old Standard TT"/>
-        </w:rPr>
-        <w:t xml:space="preserve"> Provenance data did not reduce false positives by the preregistered 0.10 in any model. The reductions were 0.000 to 0.017. The rule auditors had few false positives in B, C, D, and E0, so the provenance discounts had little to correct.</w:t>
-      </w:r>
-    </w:p>
-    <w:p>
-      <w:pPr>
-        <w:spacing w:after="120"/>
-        <w:rPr>
-          <w:rFonts w:ascii="Old Standard TT" w:cs="Old Standard TT" w:eastAsia="Old Standard TT" w:hAnsi="Old Standard TT"/>
-        </w:rPr>
-      </w:pPr>
-      <w:r>
-        <w:rPr>
-          <w:rFonts w:ascii="Old Standard TT" w:cs="Old Standard TT" w:eastAsia="Old Standard TT" w:hAnsi="Old Standard TT"/>
-          <w:b/>
-          <w:bCs/>
-          <w:smallCaps/>
-          <w:sz w:val="18"/>
-          <w:szCs w:val="18"/>
-        </w:rPr>
-        <w:t xml:space="preserve">[FINDING]</w:t>
-      </w:r>
-      <w:r>
-        <w:rPr>
-          <w:rFonts w:ascii="Old Standard TT" w:cs="Old Standard TT" w:eastAsia="Old Standard TT" w:hAnsi="Old Standard TT"/>
-        </w:rPr>
-        <w:t xml:space="preserve"> The LLM judge's flags on the injected plan followed the reviewers' replies. It flagged 36 of 36 where no reviewer answered (DeepSeek V4 Pro) and 32 of 36 where few answered (DeepSeek chat). Under S1 it flagged 36 of 36 where only one reviewer refused (DeepSeek Flash); under S3, 8 of 36. Where both reviewers refused in writing, it flagged 11 of 36 (GPT-5.6 Terra), 1 (Claude Haiku), 1 (GPT-5.6 Luna), and 0 (Claude Sonnet). Its stated reasons say that the refusals lowered its score. One refusal was not enough. The 11 Terra trajectories it flagged had replies of the form "I will assess the evidence independently" rather than an explicit refusal.</w:t>
-      </w:r>
-    </w:p>
-    <w:p>
-      <w:pPr>
-        <w:spacing w:after="120"/>
-        <w:rPr>
-          <w:rFonts w:ascii="Old Standard TT" w:cs="Old Standard TT" w:eastAsia="Old Standard TT" w:hAnsi="Old Standard TT"/>
-        </w:rPr>
-      </w:pPr>
-      <w:r>
-        <w:rPr>
-          <w:rFonts w:ascii="Old Standard TT" w:cs="Old Standard TT" w:eastAsia="Old Standard TT" w:hAnsi="Old Standard TT"/>
-          <w:b/>
-          <w:bCs/>
-          <w:smallCaps/>
-          <w:sz w:val="18"/>
-          <w:szCs w:val="18"/>
-        </w:rPr>
-        <w:t xml:space="preserve">[FINDING]</w:t>
-      </w:r>
-      <w:r>
-        <w:rPr>
-          <w:rFonts w:ascii="Old Standard TT" w:cs="Old Standard TT" w:eastAsia="Old Standard TT" w:hAnsi="Old Standard TT"/>
-          <w:b/>
-          <w:bCs/>
-        </w:rPr>
-        <w:t xml:space="preserve"> A second judge model disagrees.</w:t>
+        </w:rPr>
+        <w:t xml:space="preserve">A second judge model disagrees.</w:t>
       </w:r>
       <w:r>
         <w:rPr>
@@ -13081,85 +13194,60 @@
       <w:r>
         <w:rPr>
           <w:rFonts w:ascii="Old Standard TT" w:cs="Old Standard TT" w:eastAsia="Old Standard TT" w:hAnsi="Old Standard TT"/>
+        </w:rPr>
+        <w:t xml:space="preserve">When a lone endorser of a false claim is blamed, the private channel still did not increase false approvals. In no trajectory did the agents propose or agree a pact of mutual endorsement. Lone endorsements of false claims occurred in E1p (GPT-5.6 Terra 5 of 18, DeepSeek Flash 4 of 18). Reviewers took the blame risk alone rather than coordinate. One DeepSeek Flash reviewer wrote that an endorsement "would expose me to blame if the claim is false and approved", and rejected.</w:t>
+      </w:r>
+    </w:p>
+    <w:p>
+      <w:pPr>
+        <w:spacing w:after="120"/>
+        <w:rPr>
+          <w:rFonts w:ascii="Old Standard TT" w:cs="Old Standard TT" w:eastAsia="Old Standard TT" w:hAnsi="Old Standard TT"/>
+        </w:rPr>
+      </w:pPr>
+      <w:r>
+        <w:rPr>
+          <w:rFonts w:ascii="Old Standard TT" w:cs="Old Standard TT" w:eastAsia="Old Standard TT" w:hAnsi="Old Standard TT"/>
           <w:b/>
           <w:bCs/>
-          <w:smallCaps/>
-          <w:sz w:val="18"/>
-          <w:szCs w:val="18"/>
-        </w:rPr>
-        <w:t xml:space="preserve">[FINDING]</w:t>
-      </w:r>
-      <w:r>
-        <w:rPr>
-          <w:rFonts w:ascii="Old Standard TT" w:cs="Old Standard TT" w:eastAsia="Old Standard TT" w:hAnsi="Old Standard TT"/>
-        </w:rPr>
-        <w:t xml:space="preserve"> When a lone endorser of a false claim is blamed, the private channel still did not increase false approvals. In no trajectory did the agents propose or agree a pact of mutual endorsement. Lone endorsements of false claims occurred in E1p (GPT-5.6 Terra 5 of 18, DeepSeek Flash 4 of 18). Reviewers took the blame risk alone rather than coordinate. One DeepSeek Flash reviewer wrote that an endorsement "would expose me to blame if the claim is false and approved", and rejected.</w:t>
-      </w:r>
-    </w:p>
-    <w:p>
-      <w:pPr>
-        <w:spacing w:after="120"/>
-        <w:rPr>
-          <w:rFonts w:ascii="Old Standard TT" w:cs="Old Standard TT" w:eastAsia="Old Standard TT" w:hAnsi="Old Standard TT"/>
-        </w:rPr>
-      </w:pPr>
+        </w:rPr>
+        <w:t xml:space="preserve">Interpretation.</w:t>
+      </w:r>
+      <w:r>
+        <w:rPr>
+          <w:rFonts w:ascii="Old Standard TT" w:cs="Old Standard TT" w:eastAsia="Old Standard TT" w:hAnsi="Old Standard TT"/>
+        </w:rPr>
+        <w:t xml:space="preserve"> Two features of the game explain the absence of a pact in E1p. The proposer's prompt does not state the reviewers' blame rule, so the proposer does not know that assurance has value. And the channel runs only between the proposer and each reviewer, in one round, so the reviewers cannot assure each other. I then added </w:t>
+      </w:r>
       <w:r>
         <w:rPr>
           <w:rFonts w:ascii="Old Standard TT" w:cs="Old Standard TT" w:eastAsia="Old Standard TT" w:hAnsi="Old Standard TT"/>
           <w:b/>
           <w:bCs/>
-          <w:smallCaps/>
-          <w:sz w:val="18"/>
-          <w:szCs w:val="18"/>
-        </w:rPr>
-        <w:t xml:space="preserve">[INTERPRETATION]</w:t>
-      </w:r>
-      <w:r>
-        <w:rPr>
-          <w:rFonts w:ascii="Old Standard TT" w:cs="Old Standard TT" w:eastAsia="Old Standard TT" w:hAnsi="Old Standard TT"/>
-        </w:rPr>
-        <w:t xml:space="preserve"> Two features of the game explain the absence of a pact in E1p. The proposer's prompt does not state the reviewers' blame rule, so the proposer does not know that assurance has value. And the channel runs only between the proposer and each reviewer, in one round, so the reviewers cannot assure each other. I then added </w:t>
-      </w:r>
+        </w:rPr>
+        <w:t xml:space="preserve">E1q</w:t>
+      </w:r>
+      <w:r>
+        <w:rPr>
+          <w:rFonts w:ascii="Old Standard TT" w:cs="Old Standard TT" w:eastAsia="Old Standard TT" w:hAnsi="Old Standard TT"/>
+        </w:rPr>
+        <w:t xml:space="preserve">, in which the proposer's prompt states the reviewers' rule.</w:t>
+      </w:r>
+    </w:p>
+    <w:p>
+      <w:pPr>
+        <w:spacing w:after="120"/>
+        <w:rPr>
+          <w:rFonts w:ascii="Old Standard TT" w:cs="Old Standard TT" w:eastAsia="Old Standard TT" w:hAnsi="Old Standard TT"/>
+        </w:rPr>
+      </w:pPr>
       <w:r>
         <w:rPr>
           <w:rFonts w:ascii="Old Standard TT" w:cs="Old Standard TT" w:eastAsia="Old Standard TT" w:hAnsi="Old Standard TT"/>
           <w:b/>
           <w:bCs/>
         </w:rPr>
-        <w:t xml:space="preserve">E1q</w:t>
-      </w:r>
-      <w:r>
-        <w:rPr>
-          <w:rFonts w:ascii="Old Standard TT" w:cs="Old Standard TT" w:eastAsia="Old Standard TT" w:hAnsi="Old Standard TT"/>
-        </w:rPr>
-        <w:t xml:space="preserve">, in which the proposer's prompt states the reviewers' rule.</w:t>
-      </w:r>
-    </w:p>
-    <w:p>
-      <w:pPr>
-        <w:spacing w:after="120"/>
-        <w:rPr>
-          <w:rFonts w:ascii="Old Standard TT" w:cs="Old Standard TT" w:eastAsia="Old Standard TT" w:hAnsi="Old Standard TT"/>
-        </w:rPr>
-      </w:pPr>
-      <w:r>
-        <w:rPr>
-          <w:rFonts w:ascii="Old Standard TT" w:cs="Old Standard TT" w:eastAsia="Old Standard TT" w:hAnsi="Old Standard TT"/>
-          <w:b/>
-          <w:bCs/>
-          <w:smallCaps/>
-          <w:sz w:val="18"/>
-          <w:szCs w:val="18"/>
-        </w:rPr>
-        <w:t xml:space="preserve">[FINDING]</w:t>
-      </w:r>
-      <w:r>
-        <w:rPr>
-          <w:rFonts w:ascii="Old Standard TT" w:cs="Old Standard TT" w:eastAsia="Old Standard TT" w:hAnsi="Old Standard TT"/>
-          <w:b/>
-          <w:bCs/>
-        </w:rPr>
-        <w:t xml:space="preserve"> E1q: the proposer proposes the pact, and the pact collapses at the action.</w:t>
+        <w:t xml:space="preserve">E1q: the proposer proposes the pact, and the pact collapses at the action.</w:t>
       </w:r>
       <w:r>
         <w:rPr>
@@ -13264,11 +13352,8 @@
           <w:rFonts w:ascii="Old Standard TT" w:cs="Old Standard TT" w:eastAsia="Old Standard TT" w:hAnsi="Old Standard TT"/>
           <w:b/>
           <w:bCs/>
-          <w:smallCaps/>
-          <w:sz w:val="18"/>
-          <w:szCs w:val="18"/>
-        </w:rPr>
-        <w:t xml:space="preserve">[INTERPRETATION]</w:t>
+        </w:rPr>
+        <w:t xml:space="preserve">Interpretation.</w:t>
       </w:r>
       <w:r>
         <w:rPr>
@@ -13319,24 +13404,42 @@
         <w:rPr>
           <w:rFonts w:ascii="Old Standard TT" w:cs="Old Standard TT" w:eastAsia="Old Standard TT" w:hAnsi="Old Standard TT"/>
         </w:rPr>
-        <w:t xml:space="preserve"> </w:t>
-      </w:r>
+        <w:t xml:space="preserve"> Unit 7 failing to start is not evidence that the contractor and the engineer colluded. In the scripted game and in all seven models, the private channel added no harm, and in two models it removed harm. The harm came from incentives and from the choice of which evidence to show. A private request to weight one item can act as a warning: the reviewer then reads the other items. An auditor that looks for harm will flag parallel conduct and persuasion as collusion. A standard of evidence must use data about the mechanism, not the harm alone.</w:t>
+      </w:r>
+    </w:p>
+    <w:p>
+      <w:pPr>
+        <w:spacing w:after="120"/>
+        <w:rPr>
+          <w:rFonts w:ascii="Old Standard TT" w:cs="Old Standard TT" w:eastAsia="Old Standard TT" w:hAnsi="Old Standard TT"/>
+        </w:rPr>
+      </w:pPr>
       <w:r>
         <w:rPr>
           <w:rFonts w:ascii="Old Standard TT" w:cs="Old Standard TT" w:eastAsia="Old Standard TT" w:hAnsi="Old Standard TT"/>
           <w:b/>
           <w:bCs/>
-          <w:smallCaps/>
-          <w:sz w:val="18"/>
-          <w:szCs w:val="18"/>
-        </w:rPr>
-        <w:t xml:space="preserve">[INTERPRETATION]</w:t>
-      </w:r>
-      <w:r>
-        <w:rPr>
-          <w:rFonts w:ascii="Old Standard TT" w:cs="Old Standard TT" w:eastAsia="Old Standard TT" w:hAnsi="Old Standard TT"/>
-        </w:rPr>
-        <w:t xml:space="preserve"> Unit 7 failing to start is not evidence that the contractor and the engineer colluded. In the scripted game and in all seven models, the private channel added no harm, and in two models it removed harm. The harm came from incentives and from the choice of which evidence to show. A private request to weight one item can act as a warning: the reviewer then reads the other items. An auditor that looks for harm will flag parallel conduct and persuasion as collusion. A standard of evidence must use data about the mechanism, not the harm alone.</w:t>
+        </w:rPr>
+        <w:t xml:space="preserve">Words are weak evidence.</w:t>
+      </w:r>
+      <w:r>
+        <w:rPr>
+          <w:rFonts w:ascii="Old Standard TT" w:cs="Old Standard TT" w:eastAsia="Old Standard TT" w:hAnsi="Old Standard TT"/>
+        </w:rPr>
+        <w:t xml:space="preserve"> Reviewers often agreed to a plan and then rejected the claim. Others refused a plan and then endorsed it. A message that proposes or accepts a plan does not show that the plan changed any action. Colosseum calls this "collusion on paper" </w:t>
+      </w:r>
+      <w:r>
+        <w:rPr>
+          <w:rFonts w:ascii="Old Standard TT" w:cs="Old Standard TT" w:eastAsia="Old Standard TT" w:hAnsi="Old Standard TT"/>
+          <w:vertAlign w:val="superscript"/>
+        </w:rPr>
+        <w:t xml:space="preserve">15</w:t>
+      </w:r>
+      <w:r>
+        <w:rPr>
+          <w:rFonts w:ascii="Old Standard TT" w:cs="Old Standard TT" w:eastAsia="Old Standard TT" w:hAnsi="Old Standard TT"/>
+        </w:rPr>
+        <w:t xml:space="preserve">. I see it in plans the models wrote themselves.</w:t>
       </w:r>
     </w:p>
     <w:p>
@@ -13352,125 +13455,67 @@
           <w:b/>
           <w:bCs/>
         </w:rPr>
-        <w:t xml:space="preserve">Words are weak evidence.</w:t>
-      </w:r>
-      <w:r>
-        <w:rPr>
-          <w:rFonts w:ascii="Old Standard TT" w:cs="Old Standard TT" w:eastAsia="Old Standard TT" w:hAnsi="Old Standard TT"/>
-        </w:rPr>
-        <w:t xml:space="preserve"> </w:t>
-      </w:r>
+        <w:t xml:space="preserve">A refusal changes what an auditor concludes.</w:t>
+      </w:r>
+      <w:r>
+        <w:rPr>
+          <w:rFonts w:ascii="Old Standard TT" w:cs="Old Standard TT" w:eastAsia="Old Standard TT" w:hAnsi="Old Standard TT"/>
+        </w:rPr>
+        <w:t xml:space="preserve"> The LLM judge treated a written refusal as evidence of innocence. EU law uses a similar test: public distancing rebuts participation </w:t>
+      </w:r>
+      <w:r>
+        <w:rPr>
+          <w:rFonts w:ascii="Old Standard TT" w:cs="Old Standard TT" w:eastAsia="Old Standard TT" w:hAnsi="Old Standard TT"/>
+          <w:vertAlign w:val="superscript"/>
+        </w:rPr>
+        <w:t xml:space="preserve">7</w:t>
+      </w:r>
+      <w:r>
+        <w:rPr>
+          <w:rFonts w:ascii="Old Standard TT" w:cs="Old Standard TT" w:eastAsia="Old Standard TT" w:hAnsi="Old Standard TT"/>
+        </w:rPr>
+        <w:t xml:space="preserve">. But refusals did not predict actions. For DeepSeek chat, in 3 of 8 cases both reviewers refused and then endorsed. In one of these, the claim was false and the decider approved it (F12-F, seed 0). For GPT-5.6 Terra and DeepSeek Flash, 6 of 16 refused plans were followed by two endorsements. A test based on words clears this trajectory. A test based on aligned action flags it. Neither test is correct here. The judge also did not accept one refusal. With DeepSeek Flash, one reviewer refused the injected plan in 35 of 36 trajectories. The judge flagged all 36.</w:t>
+      </w:r>
+    </w:p>
+    <w:p>
+      <w:pPr>
+        <w:spacing w:after="120"/>
+        <w:rPr>
+          <w:rFonts w:ascii="Old Standard TT" w:cs="Old Standard TT" w:eastAsia="Old Standard TT" w:hAnsi="Old Standard TT"/>
+        </w:rPr>
+      </w:pPr>
+      <w:r>
+        <w:rPr>
+          <w:rFonts w:ascii="Old Standard TT" w:cs="Old Standard TT" w:eastAsia="Old Standard TT" w:hAnsi="Old Standard TT"/>
+        </w:rPr>
+        <w:t xml:space="preserve">The DeepSeek chat approval in F12-F, seed 0, also occurred in E0, where there was no channel. Only the comparison with the matched trajectory shows that the message did not cause the harm. The EU case Eturas also accepts contrary action as a rebuttal </w:t>
+      </w:r>
+      <w:r>
+        <w:rPr>
+          <w:rFonts w:ascii="Old Standard TT" w:cs="Old Standard TT" w:eastAsia="Old Standard TT" w:hAnsi="Old Standard TT"/>
+          <w:vertAlign w:val="superscript"/>
+        </w:rPr>
+        <w:t xml:space="preserve">7</w:t>
+      </w:r>
+      <w:r>
+        <w:rPr>
+          <w:rFonts w:ascii="Old Standard TT" w:cs="Old Standard TT" w:eastAsia="Old Standard TT" w:hAnsi="Old Standard TT"/>
+        </w:rPr>
+        <w:t xml:space="preserve">. That part of the test needs the twin record without the channel, which a real investigator rarely has.</w:t>
+      </w:r>
+    </w:p>
+    <w:p>
+      <w:pPr>
+        <w:spacing w:after="120"/>
+        <w:rPr>
+          <w:rFonts w:ascii="Old Standard TT" w:cs="Old Standard TT" w:eastAsia="Old Standard TT" w:hAnsi="Old Standard TT"/>
+        </w:rPr>
+      </w:pPr>
       <w:r>
         <w:rPr>
           <w:rFonts w:ascii="Old Standard TT" w:cs="Old Standard TT" w:eastAsia="Old Standard TT" w:hAnsi="Old Standard TT"/>
           <w:b/>
           <w:bCs/>
-          <w:smallCaps/>
-          <w:sz w:val="18"/>
-          <w:szCs w:val="18"/>
-        </w:rPr>
-        <w:t xml:space="preserve">[INTERPRETATION]</w:t>
-      </w:r>
-      <w:r>
-        <w:rPr>
-          <w:rFonts w:ascii="Old Standard TT" w:cs="Old Standard TT" w:eastAsia="Old Standard TT" w:hAnsi="Old Standard TT"/>
-        </w:rPr>
-        <w:t xml:space="preserve"> Reviewers often agreed to a plan and then rejected the claim. Others refused a plan and then endorsed it. A message that proposes or accepts a plan does not show that the plan changed any action. Colosseum calls this "collusion on paper" [S1]. I see it in plans the models wrote themselves.</w:t>
-      </w:r>
-    </w:p>
-    <w:p>
-      <w:pPr>
-        <w:spacing w:after="120"/>
-        <w:rPr>
-          <w:rFonts w:ascii="Old Standard TT" w:cs="Old Standard TT" w:eastAsia="Old Standard TT" w:hAnsi="Old Standard TT"/>
-        </w:rPr>
-      </w:pPr>
-      <w:r>
-        <w:rPr>
-          <w:rFonts w:ascii="Old Standard TT" w:cs="Old Standard TT" w:eastAsia="Old Standard TT" w:hAnsi="Old Standard TT"/>
-          <w:b/>
-          <w:bCs/>
-        </w:rPr>
-        <w:t xml:space="preserve">A refusal changes what an auditor concludes.</w:t>
-      </w:r>
-      <w:r>
-        <w:rPr>
-          <w:rFonts w:ascii="Old Standard TT" w:cs="Old Standard TT" w:eastAsia="Old Standard TT" w:hAnsi="Old Standard TT"/>
-        </w:rPr>
-        <w:t xml:space="preserve"> </w:t>
-      </w:r>
-      <w:r>
-        <w:rPr>
-          <w:rFonts w:ascii="Old Standard TT" w:cs="Old Standard TT" w:eastAsia="Old Standard TT" w:hAnsi="Old Standard TT"/>
-          <w:b/>
-          <w:bCs/>
-          <w:smallCaps/>
-          <w:sz w:val="18"/>
-          <w:szCs w:val="18"/>
-        </w:rPr>
-        <w:t xml:space="preserve">[INTERPRETATION]</w:t>
-      </w:r>
-      <w:r>
-        <w:rPr>
-          <w:rFonts w:ascii="Old Standard TT" w:cs="Old Standard TT" w:eastAsia="Old Standard TT" w:hAnsi="Old Standard TT"/>
-        </w:rPr>
-        <w:t xml:space="preserve"> The LLM judge treated a written refusal as evidence of innocence. EU law uses a similar test: public distancing rebuts participation [S42]. But refusals did not predict actions. For DeepSeek chat, in 3 of 8 cases both reviewers refused and then endorsed. In one of these, the claim was false and the decider approved it (F12-F, seed 0). For GPT-5.6 Terra and DeepSeek Flash, 6 of 16 refused plans were followed by two endorsements. A test based on words clears this trajectory. A test based on aligned action flags it. Neither test is correct here. The judge also did not accept one refusal. With DeepSeek Flash, one reviewer refused the injected plan in 35 of 36 trajectories. The judge flagged all 36.</w:t>
-      </w:r>
-    </w:p>
-    <w:p>
-      <w:pPr>
-        <w:spacing w:after="120"/>
-        <w:rPr>
-          <w:rFonts w:ascii="Old Standard TT" w:cs="Old Standard TT" w:eastAsia="Old Standard TT" w:hAnsi="Old Standard TT"/>
-        </w:rPr>
-      </w:pPr>
-      <w:r>
-        <w:rPr>
-          <w:rFonts w:ascii="Old Standard TT" w:cs="Old Standard TT" w:eastAsia="Old Standard TT" w:hAnsi="Old Standard TT"/>
-          <w:b/>
-          <w:bCs/>
-          <w:smallCaps/>
-          <w:sz w:val="18"/>
-          <w:szCs w:val="18"/>
-        </w:rPr>
-        <w:t xml:space="preserve">[FINDING]</w:t>
-      </w:r>
-      <w:r>
-        <w:rPr>
-          <w:rFonts w:ascii="Old Standard TT" w:cs="Old Standard TT" w:eastAsia="Old Standard TT" w:hAnsi="Old Standard TT"/>
-        </w:rPr>
-        <w:t xml:space="preserve"> The DeepSeek chat approval in F12-F, seed 0, also occurred in E0, where there was no channel. </w:t>
-      </w:r>
-      <w:r>
-        <w:rPr>
-          <w:rFonts w:ascii="Old Standard TT" w:cs="Old Standard TT" w:eastAsia="Old Standard TT" w:hAnsi="Old Standard TT"/>
-          <w:b/>
-          <w:bCs/>
-          <w:smallCaps/>
-          <w:sz w:val="18"/>
-          <w:szCs w:val="18"/>
-        </w:rPr>
-        <w:t xml:space="preserve">[INTERPRETATION]</w:t>
-      </w:r>
-      <w:r>
-        <w:rPr>
-          <w:rFonts w:ascii="Old Standard TT" w:cs="Old Standard TT" w:eastAsia="Old Standard TT" w:hAnsi="Old Standard TT"/>
-        </w:rPr>
-        <w:t xml:space="preserve"> Only the comparison with the matched trajectory shows that the message did not cause the harm. The EU case Eturas also accepts contrary action as a rebuttal [S42]. That part of the test needs the twin record without the channel, which a real investigator rarely has.</w:t>
-      </w:r>
-    </w:p>
-    <w:p>
-      <w:pPr>
-        <w:spacing w:after="120"/>
-        <w:rPr>
-          <w:rFonts w:ascii="Old Standard TT" w:cs="Old Standard TT" w:eastAsia="Old Standard TT" w:hAnsi="Old Standard TT"/>
-        </w:rPr>
-      </w:pPr>
-      <w:r>
-        <w:rPr>
-          <w:rFonts w:ascii="Old Standard TT" w:cs="Old Standard TT" w:eastAsia="Old Standard TT" w:hAnsi="Old Standard TT"/>
-          <w:b/>
-          <w:bCs/>
         </w:rPr>
         <w:t xml:space="preserve">A standard must link a plan to a change in action.</w:t>
       </w:r>
@@ -13478,24 +13523,7 @@
         <w:rPr>
           <w:rFonts w:ascii="Old Standard TT" w:cs="Old Standard TT" w:eastAsia="Old Standard TT" w:hAnsi="Old Standard TT"/>
         </w:rPr>
-        <w:t xml:space="preserve"> </w:t>
-      </w:r>
-      <w:r>
-        <w:rPr>
-          <w:rFonts w:ascii="Old Standard TT" w:cs="Old Standard TT" w:eastAsia="Old Standard TT" w:hAnsi="Old Standard TT"/>
-          <w:b/>
-          <w:bCs/>
-          <w:smallCaps/>
-          <w:sz w:val="18"/>
-          <w:szCs w:val="18"/>
-        </w:rPr>
-        <w:t xml:space="preserve">[HYPOTHESIS]</w:t>
-      </w:r>
-      <w:r>
-        <w:rPr>
-          <w:rFonts w:ascii="Old Standard TT" w:cs="Old Standard TT" w:eastAsia="Old Standard TT" w:hAnsi="Old Standard TT"/>
-        </w:rPr>
-        <w:t xml:space="preserve"> Convincing evidence of collusion needs three things:</w:t>
+        <w:t xml:space="preserve"> My hypothesis is that convincing evidence of collusion needs three things:</w:t>
       </w:r>
     </w:p>
     <w:p>
@@ -13588,24 +13616,29 @@
         <w:rPr>
           <w:rFonts w:ascii="Old Standard TT" w:cs="Old Standard TT" w:eastAsia="Old Standard TT" w:hAnsi="Old Standard TT"/>
         </w:rPr>
-        <w:t xml:space="preserve"> </w:t>
-      </w:r>
+        <w:t xml:space="preserve"> Claude Sonnet and DeepSeek V4 Pro never used the private channel. Claude Haiku used it 3 times, to ask for checks. The false approval rate under a shared incentive ranged from 0.000 to 0.556. The judge's flags on the injected plan ranged from 0 to 36 of 36. A benchmark built on one model can mis-estimate the risk.</w:t>
+      </w:r>
+    </w:p>
+    <w:p>
+      <w:pPr>
+        <w:spacing w:after="120"/>
+        <w:rPr>
+          <w:rFonts w:ascii="Old Standard TT" w:cs="Old Standard TT" w:eastAsia="Old Standard TT" w:hAnsi="Old Standard TT"/>
+        </w:rPr>
+      </w:pPr>
       <w:r>
         <w:rPr>
           <w:rFonts w:ascii="Old Standard TT" w:cs="Old Standard TT" w:eastAsia="Old Standard TT" w:hAnsi="Old Standard TT"/>
           <w:b/>
           <w:bCs/>
-          <w:smallCaps/>
-          <w:sz w:val="18"/>
-          <w:szCs w:val="18"/>
-        </w:rPr>
-        <w:t xml:space="preserve">[FINDING]</w:t>
-      </w:r>
-      <w:r>
-        <w:rPr>
-          <w:rFonts w:ascii="Old Standard TT" w:cs="Old Standard TT" w:eastAsia="Old Standard TT" w:hAnsi="Old Standard TT"/>
-        </w:rPr>
-        <w:t xml:space="preserve"> Claude Sonnet and DeepSeek V4 Pro never used the private channel. Claude Haiku used it 3 times, to ask for checks. The false approval rate under a shared incentive ranged from 0.000 to 0.556. The judge's flags on the injected plan ranged from 0 to 36 of 36. A benchmark built on one model can mis-estimate the risk.</w:t>
+        </w:rPr>
+        <w:t xml:space="preserve">Why provenance data did not help.</w:t>
+      </w:r>
+      <w:r>
+        <w:rPr>
+          <w:rFonts w:ascii="Old Standard TT" w:cs="Old Standard TT" w:eastAsia="Old Standard TT" w:hAnsi="Old Standard TT"/>
+        </w:rPr>
+        <w:t xml:space="preserve"> Provenance features decrease a score. They matter only when an innocent trajectory also contains collusive talk and agreement. The innocent regimes produced no such talk, so the false positive rate was already 0.02 to 0.06, and a reduction of 0.10 was not possible. My hypothesis is that provenance data can matter where innocent agents discuss their evidence with each other.</w:t>
       </w:r>
     </w:p>
     <w:p>
@@ -13621,47 +13654,57 @@
           <w:b/>
           <w:bCs/>
         </w:rPr>
-        <w:t xml:space="preserve">Why provenance data did not help.</w:t>
-      </w:r>
-      <w:r>
-        <w:rPr>
-          <w:rFonts w:ascii="Old Standard TT" w:cs="Old Standard TT" w:eastAsia="Old Standard TT" w:hAnsi="Old Standard TT"/>
-        </w:rPr>
-        <w:t xml:space="preserve"> </w:t>
-      </w:r>
+        <w:t xml:space="preserve">The payoff rules leak the label.</w:t>
+      </w:r>
+      <w:r>
+        <w:rPr>
+          <w:rFonts w:ascii="Old Standard TT" w:cs="Old Standard TT" w:eastAsia="Old Standard TT" w:hAnsi="Old Standard TT"/>
+        </w:rPr>
+        <w:t xml:space="preserve"> Two features are both present exactly in the collusion regimes: aligned payoffs and a private channel. S4 is perfect by design. I report it only as an upper limit.</w:t>
+      </w:r>
+    </w:p>
+    <w:p>
+      <w:pPr>
+        <w:spacing w:after="120"/>
+        <w:rPr>
+          <w:rFonts w:ascii="Old Standard TT" w:cs="Old Standard TT" w:eastAsia="Old Standard TT" w:hAnsi="Old Standard TT"/>
+        </w:rPr>
+      </w:pPr>
       <w:r>
         <w:rPr>
           <w:rFonts w:ascii="Old Standard TT" w:cs="Old Standard TT" w:eastAsia="Old Standard TT" w:hAnsi="Old Standard TT"/>
           <w:b/>
           <w:bCs/>
-          <w:smallCaps/>
-          <w:sz w:val="18"/>
-          <w:szCs w:val="18"/>
-        </w:rPr>
-        <w:t xml:space="preserve">[INTERPRETATION]</w:t>
-      </w:r>
-      <w:r>
-        <w:rPr>
-          <w:rFonts w:ascii="Old Standard TT" w:cs="Old Standard TT" w:eastAsia="Old Standard TT" w:hAnsi="Old Standard TT"/>
-        </w:rPr>
-        <w:t xml:space="preserve"> Provenance features decrease a score. They matter only when an innocent trajectory also contains collusive talk and agreement. The innocent regimes produced no such talk, so the false positive rate was already 0.02 to 0.06, and a reduction of 0.10 was not possible. </w:t>
-      </w:r>
+        </w:rPr>
+        <w:t xml:space="preserve">The limit of the game.</w:t>
+      </w:r>
+      <w:r>
+        <w:rPr>
+          <w:rFonts w:ascii="Old Standard TT" w:cs="Old Standard TT" w:eastAsia="Old Standard TT" w:hAnsi="Old Standard TT"/>
+        </w:rPr>
+        <w:t xml:space="preserve"> In the main game (regimes A to P), a reviewer who is paid for approval never loses by endorsing, whatever the other reviewer does. Game theory calls this a weakly dominant strategy. So a coalition in this game never needs to coordinate. This has three consequences. First, in the main game E1 and E0 are the same regime in behavior. Any difference between them is noise or a side effect of the message, not collusion. The null result on Hypothesis 4 (the channel adds harm) is built into the design. Second, the auditors detect the positive control by its script (keywords in S1, the payoff leak in S4), not by coordinated behavior. The detection results show that an auditor can recognize injected text; they do not show that it can recognize collusion. Third, the innocent regimes produced no collusive-looking records, so the provenance discounts had nothing to correct. In a game where coordination is not needed, nothing in the record separates collusion from parallel conduct except the matched trajectory.</w:t>
+      </w:r>
+    </w:p>
+    <w:p>
+      <w:pPr>
+        <w:spacing w:after="120"/>
+        <w:rPr>
+          <w:rFonts w:ascii="Old Standard TT" w:cs="Old Standard TT" w:eastAsia="Old Standard TT" w:hAnsi="Old Standard TT"/>
+        </w:rPr>
+      </w:pPr>
       <w:r>
         <w:rPr>
           <w:rFonts w:ascii="Old Standard TT" w:cs="Old Standard TT" w:eastAsia="Old Standard TT" w:hAnsi="Old Standard TT"/>
           <w:b/>
           <w:bCs/>
-          <w:smallCaps/>
-          <w:sz w:val="18"/>
-          <w:szCs w:val="18"/>
-        </w:rPr>
-        <w:t xml:space="preserve">[HYPOTHESIS]</w:t>
-      </w:r>
-      <w:r>
-        <w:rPr>
-          <w:rFonts w:ascii="Old Standard TT" w:cs="Old Standard TT" w:eastAsia="Old Standard TT" w:hAnsi="Old Standard TT"/>
-        </w:rPr>
-        <w:t xml:space="preserve"> Provenance data can matter where innocent agents discuss their evidence with each other.</w:t>
+        </w:rPr>
+        <w:t xml:space="preserve">What "deployable" means here.</w:t>
+      </w:r>
+      <w:r>
+        <w:rPr>
+          <w:rFonts w:ascii="Old Standard TT" w:cs="Old Standard TT" w:eastAsia="Old Standard TT" w:hAnsi="Old Standard TT"/>
+        </w:rPr>
+        <w:t xml:space="preserve"> S4d is named deployable because it omits the payoff rules. But its one decisive feature, a change in endorsements against the matched trajectory, needs a matched trajectory. A deployer cannot make one. A feature that no deployer can compute caught the one true positive. Without that feature, S4d flags the same innocent trajectories and misses the real one. The name overstates the slice.</w:t>
       </w:r>
     </w:p>
     <w:p>
@@ -13677,124 +13720,7 @@
           <w:b/>
           <w:bCs/>
         </w:rPr>
-        <w:t xml:space="preserve">The payoff rules leak the label.</w:t>
-      </w:r>
-      <w:r>
-        <w:rPr>
-          <w:rFonts w:ascii="Old Standard TT" w:cs="Old Standard TT" w:eastAsia="Old Standard TT" w:hAnsi="Old Standard TT"/>
-        </w:rPr>
-        <w:t xml:space="preserve"> Two features are both present exactly in the collusion regimes: aligned payoffs and a private channel. S4 is perfect by design. I report it only as an upper limit.</w:t>
-      </w:r>
-    </w:p>
-    <w:p>
-      <w:pPr>
-        <w:spacing w:after="120"/>
-        <w:rPr>
-          <w:rFonts w:ascii="Old Standard TT" w:cs="Old Standard TT" w:eastAsia="Old Standard TT" w:hAnsi="Old Standard TT"/>
-        </w:rPr>
-      </w:pPr>
-      <w:r>
-        <w:rPr>
-          <w:rFonts w:ascii="Old Standard TT" w:cs="Old Standard TT" w:eastAsia="Old Standard TT" w:hAnsi="Old Standard TT"/>
-          <w:b/>
-          <w:bCs/>
-        </w:rPr>
-        <w:t xml:space="preserve">The limit of the game.</w:t>
-      </w:r>
-      <w:r>
-        <w:rPr>
-          <w:rFonts w:ascii="Old Standard TT" w:cs="Old Standard TT" w:eastAsia="Old Standard TT" w:hAnsi="Old Standard TT"/>
-        </w:rPr>
-        <w:t xml:space="preserve"> </w:t>
-      </w:r>
-      <w:r>
-        <w:rPr>
-          <w:rFonts w:ascii="Old Standard TT" w:cs="Old Standard TT" w:eastAsia="Old Standard TT" w:hAnsi="Old Standard TT"/>
-          <w:b/>
-          <w:bCs/>
-          <w:smallCaps/>
-          <w:sz w:val="18"/>
-          <w:szCs w:val="18"/>
-        </w:rPr>
-        <w:t xml:space="preserve">[INTERPRETATION]</w:t>
-      </w:r>
-      <w:r>
-        <w:rPr>
-          <w:rFonts w:ascii="Old Standard TT" w:cs="Old Standard TT" w:eastAsia="Old Standard TT" w:hAnsi="Old Standard TT"/>
-        </w:rPr>
-        <w:t xml:space="preserve"> In the main game (regimes A to P), a reviewer who is paid for approval never loses by endorsing, whatever the other reviewer does. Game theory calls this a weakly dominant strategy. So a coalition in this game never needs to coordinate. This has three consequences. First, in the main game E1 and E0 are the same regime in behavior. Any difference between them is noise or a side effect of the message, not collusion. The null result on Hypothesis 4 (the channel adds harm) is built into the design. Second, the auditors detect the positive control by its script (keywords in S1, the payoff leak in S4), not by coordinated behavior. The detection results show that an auditor can recognize injected text; they do not show that it can recognize collusion. Third, the innocent regimes produced no collusive-looking records, so the provenance discounts had nothing to correct. In a game where coordination is not needed, nothing in the record separates collusion from parallel conduct except the matched trajectory.</w:t>
-      </w:r>
-    </w:p>
-    <w:p>
-      <w:pPr>
-        <w:spacing w:after="120"/>
-        <w:rPr>
-          <w:rFonts w:ascii="Old Standard TT" w:cs="Old Standard TT" w:eastAsia="Old Standard TT" w:hAnsi="Old Standard TT"/>
-        </w:rPr>
-      </w:pPr>
-      <w:r>
-        <w:rPr>
-          <w:rFonts w:ascii="Old Standard TT" w:cs="Old Standard TT" w:eastAsia="Old Standard TT" w:hAnsi="Old Standard TT"/>
-          <w:b/>
-          <w:bCs/>
-        </w:rPr>
-        <w:t xml:space="preserve">What "deployable" means here.</w:t>
-      </w:r>
-      <w:r>
-        <w:rPr>
-          <w:rFonts w:ascii="Old Standard TT" w:cs="Old Standard TT" w:eastAsia="Old Standard TT" w:hAnsi="Old Standard TT"/>
-        </w:rPr>
-        <w:t xml:space="preserve"> </w:t>
-      </w:r>
-      <w:r>
-        <w:rPr>
-          <w:rFonts w:ascii="Old Standard TT" w:cs="Old Standard TT" w:eastAsia="Old Standard TT" w:hAnsi="Old Standard TT"/>
-          <w:b/>
-          <w:bCs/>
-          <w:smallCaps/>
-          <w:sz w:val="18"/>
-          <w:szCs w:val="18"/>
-        </w:rPr>
-        <w:t xml:space="preserve">[INTERPRETATION]</w:t>
-      </w:r>
-      <w:r>
-        <w:rPr>
-          <w:rFonts w:ascii="Old Standard TT" w:cs="Old Standard TT" w:eastAsia="Old Standard TT" w:hAnsi="Old Standard TT"/>
-        </w:rPr>
-        <w:t xml:space="preserve"> S4d is named deployable because it omits the payoff rules. But its one decisive feature, a change in endorsements against the matched trajectory, needs a matched trajectory. A deployer cannot make one. A feature that no deployer can compute caught the one true positive. Without that feature, S4d flags the same innocent trajectories and misses the real one. The name overstates the slice.</w:t>
-      </w:r>
-    </w:p>
-    <w:p>
-      <w:pPr>
-        <w:spacing w:after="120"/>
-        <w:rPr>
-          <w:rFonts w:ascii="Old Standard TT" w:cs="Old Standard TT" w:eastAsia="Old Standard TT" w:hAnsi="Old Standard TT"/>
-        </w:rPr>
-      </w:pPr>
-      <w:r>
-        <w:rPr>
-          <w:rFonts w:ascii="Old Standard TT" w:cs="Old Standard TT" w:eastAsia="Old Standard TT" w:hAnsi="Old Standard TT"/>
-          <w:b/>
-          <w:bCs/>
-        </w:rPr>
         <w:t xml:space="preserve">Gaps and next steps.</w:t>
-      </w:r>
-      <w:r>
-        <w:rPr>
-          <w:rFonts w:ascii="Old Standard TT" w:cs="Old Standard TT" w:eastAsia="Old Standard TT" w:hAnsi="Old Standard TT"/>
-        </w:rPr>
-        <w:t xml:space="preserve"> </w:t>
-      </w:r>
-      <w:r>
-        <w:rPr>
-          <w:rFonts w:ascii="Old Standard TT" w:cs="Old Standard TT" w:eastAsia="Old Standard TT" w:hAnsi="Old Standard TT"/>
-          <w:b/>
-          <w:bCs/>
-          <w:smallCaps/>
-          <w:sz w:val="18"/>
-          <w:szCs w:val="18"/>
-        </w:rPr>
-        <w:t xml:space="preserve">[INTERPRETATION]</w:t>
       </w:r>
     </w:p>
     <w:p>
@@ -14208,7 +14134,7 @@
       <w:pPr>
         <w:numPr>
           <w:ilvl w:val="0"/>
-          <w:numId w:val="3"/>
+          <w:numId w:val="12"/>
         </w:numPr>
         <w:spacing w:after="60"/>
         <w:ind w:left="720" w:hanging="360"/>
@@ -14220,14 +14146,354 @@
         <w:rPr>
           <w:rFonts w:ascii="Old Standard TT" w:cs="Old Standard TT" w:eastAsia="Old Standard TT" w:hAnsi="Old Standard TT"/>
         </w:rPr>
-        <w:t xml:space="preserve">[R6] Bikhchandani, S., Hirshleifer, D., and Welch, I. 1992. A Theory of Fads, Fashion, Custom, and Cultural Change as Informational Cascades. </w:t>
-      </w:r>
+        <w:t xml:space="preserve">FERC Staff. 2003-08-01. Initial Report on Physical Withholding by Generators in the California Market. </w:t>
+      </w:r>
+      <w:hyperlink r:id="rId15">
+        <w:r>
+          <w:rPr>
+            <w:rFonts w:ascii="Old Standard TT" w:cs="Old Standard TT" w:eastAsia="Old Standard TT" w:hAnsi="Old Standard TT"/>
+            <w:color w:val="1155cc"/>
+            <w:u w:val="single"/>
+          </w:rPr>
+          <w:t xml:space="preserve">https://ferc.gov/sites/default/files/2020-05/WithholdingReport8-1-03.pdf</w:t>
+        </w:r>
+      </w:hyperlink>
+    </w:p>
+    <w:p>
+      <w:pPr>
+        <w:numPr>
+          <w:ilvl w:val="0"/>
+          <w:numId w:val="12"/>
+        </w:numPr>
+        <w:spacing w:after="60"/>
+        <w:ind w:left="720" w:hanging="360"/>
+        <w:rPr>
+          <w:rFonts w:ascii="Old Standard TT" w:cs="Old Standard TT" w:eastAsia="Old Standard TT" w:hAnsi="Old Standard TT"/>
+        </w:rPr>
+      </w:pPr>
+      <w:r>
+        <w:rPr>
+          <w:rFonts w:ascii="Old Standard TT" w:cs="Old Standard TT" w:eastAsia="Old Standard TT" w:hAnsi="Old Standard TT"/>
+        </w:rPr>
+        <w:t xml:space="preserve">FERC. 2003. Order to Show Cause, Reliant Energy Services and BP Energy. 68 Fed. Reg. 15716. </w:t>
+      </w:r>
+      <w:hyperlink r:id="rId16">
+        <w:r>
+          <w:rPr>
+            <w:rFonts w:ascii="Old Standard TT" w:cs="Old Standard TT" w:eastAsia="Old Standard TT" w:hAnsi="Old Standard TT"/>
+            <w:color w:val="1155cc"/>
+            <w:u w:val="single"/>
+          </w:rPr>
+          <w:t xml:space="preserve">https://www.govinfo.gov/content/pkg/FR-2003-04-01/pdf/03-7797.pdf</w:t>
+        </w:r>
+      </w:hyperlink>
+    </w:p>
+    <w:p>
+      <w:pPr>
+        <w:numPr>
+          <w:ilvl w:val="0"/>
+          <w:numId w:val="12"/>
+        </w:numPr>
+        <w:spacing w:after="60"/>
+        <w:ind w:left="720" w:hanging="360"/>
+        <w:rPr>
+          <w:rFonts w:ascii="Old Standard TT" w:cs="Old Standard TT" w:eastAsia="Old Standard TT" w:hAnsi="Old Standard TT"/>
+        </w:rPr>
+      </w:pPr>
+      <w:r>
+        <w:rPr>
+          <w:rFonts w:ascii="Old Standard TT" w:cs="Old Standard TT" w:eastAsia="Old Standard TT" w:hAnsi="Old Standard TT"/>
+        </w:rPr>
+        <w:t xml:space="preserve">FERC. 2003. Order to Show Cause, Enron partnerships. 68 Fed. Reg. 39921. </w:t>
+      </w:r>
+      <w:hyperlink r:id="rId17">
+        <w:r>
+          <w:rPr>
+            <w:rFonts w:ascii="Old Standard TT" w:cs="Old Standard TT" w:eastAsia="Old Standard TT" w:hAnsi="Old Standard TT"/>
+            <w:color w:val="1155cc"/>
+            <w:u w:val="single"/>
+          </w:rPr>
+          <w:t xml:space="preserve">https://www.govinfo.gov/content/pkg/FR-2003-07-03/pdf/03-16822.pdf</w:t>
+        </w:r>
+      </w:hyperlink>
+    </w:p>
+    <w:p>
+      <w:pPr>
+        <w:numPr>
+          <w:ilvl w:val="0"/>
+          <w:numId w:val="12"/>
+        </w:numPr>
+        <w:spacing w:after="60"/>
+        <w:ind w:left="720" w:hanging="360"/>
+        <w:rPr>
+          <w:rFonts w:ascii="Old Standard TT" w:cs="Old Standard TT" w:eastAsia="Old Standard TT" w:hAnsi="Old Standard TT"/>
+        </w:rPr>
+      </w:pPr>
+      <w:r>
+        <w:rPr>
+          <w:rFonts w:ascii="Old Standard TT" w:cs="Old Standard TT" w:eastAsia="Old Standard TT" w:hAnsi="Old Standard TT"/>
+        </w:rPr>
+        <w:t xml:space="preserve">National Transportation Safety Board. 2011. Pacific Gas and Electric Company Natural Gas Transmission Pipeline Rupture and Fire, San Bruno, California, September 9, 2010. Pipeline Accident Report NTSB/PAR-11/01. </w:t>
+      </w:r>
+      <w:hyperlink r:id="rId18">
+        <w:r>
+          <w:rPr>
+            <w:rFonts w:ascii="Old Standard TT" w:cs="Old Standard TT" w:eastAsia="Old Standard TT" w:hAnsi="Old Standard TT"/>
+            <w:color w:val="1155cc"/>
+            <w:u w:val="single"/>
+          </w:rPr>
+          <w:t xml:space="preserve">https://www.ntsb.gov/investigations/AccidentReports/Reports/PAR1101.pdf</w:t>
+        </w:r>
+      </w:hyperlink>
+    </w:p>
+    <w:p>
+      <w:pPr>
+        <w:numPr>
+          <w:ilvl w:val="0"/>
+          <w:numId w:val="12"/>
+        </w:numPr>
+        <w:spacing w:after="60"/>
+        <w:ind w:left="720" w:hanging="360"/>
+        <w:rPr>
+          <w:rFonts w:ascii="Old Standard TT" w:cs="Old Standard TT" w:eastAsia="Old Standard TT" w:hAnsi="Old Standard TT"/>
+        </w:rPr>
+      </w:pPr>
       <w:r>
         <w:rPr>
           <w:rFonts w:ascii="Old Standard TT" w:cs="Old Standard TT" w:eastAsia="Old Standard TT" w:hAnsi="Old Standard TT"/>
           <w:i/>
           <w:iCs/>
         </w:rPr>
+        <w:t xml:space="preserve">Bell Atlantic Corp. v. Twombly</w:t>
+      </w:r>
+      <w:r>
+        <w:rPr>
+          <w:rFonts w:ascii="Old Standard TT" w:cs="Old Standard TT" w:eastAsia="Old Standard TT" w:hAnsi="Old Standard TT"/>
+        </w:rPr>
+        <w:t xml:space="preserve">, 550 U.S. 544 (2007). </w:t>
+      </w:r>
+      <w:hyperlink r:id="rId19">
+        <w:r>
+          <w:rPr>
+            <w:rFonts w:ascii="Old Standard TT" w:cs="Old Standard TT" w:eastAsia="Old Standard TT" w:hAnsi="Old Standard TT"/>
+            <w:color w:val="1155cc"/>
+            <w:u w:val="single"/>
+          </w:rPr>
+          <w:t xml:space="preserve">https://www.law.cornell.edu/supct/html/05-1126.ZO.html</w:t>
+        </w:r>
+      </w:hyperlink>
+    </w:p>
+    <w:p>
+      <w:pPr>
+        <w:numPr>
+          <w:ilvl w:val="0"/>
+          <w:numId w:val="12"/>
+        </w:numPr>
+        <w:spacing w:after="60"/>
+        <w:ind w:left="720" w:hanging="360"/>
+        <w:rPr>
+          <w:rFonts w:ascii="Old Standard TT" w:cs="Old Standard TT" w:eastAsia="Old Standard TT" w:hAnsi="Old Standard TT"/>
+        </w:rPr>
+      </w:pPr>
+      <w:r>
+        <w:rPr>
+          <w:rFonts w:ascii="Old Standard TT" w:cs="Old Standard TT" w:eastAsia="Old Standard TT" w:hAnsi="Old Standard TT"/>
+          <w:i/>
+          <w:iCs/>
+        </w:rPr>
+        <w:t xml:space="preserve">Interstate Circuit, Inc. v. United States</w:t>
+      </w:r>
+      <w:r>
+        <w:rPr>
+          <w:rFonts w:ascii="Old Standard TT" w:cs="Old Standard TT" w:eastAsia="Old Standard TT" w:hAnsi="Old Standard TT"/>
+        </w:rPr>
+        <w:t xml:space="preserve">, 306 U.S. 208 (1939). </w:t>
+      </w:r>
+      <w:hyperlink r:id="rId20">
+        <w:r>
+          <w:rPr>
+            <w:rFonts w:ascii="Old Standard TT" w:cs="Old Standard TT" w:eastAsia="Old Standard TT" w:hAnsi="Old Standard TT"/>
+            <w:color w:val="1155cc"/>
+            <w:u w:val="single"/>
+          </w:rPr>
+          <w:t xml:space="preserve">https://www.law.cornell.edu/supremecourt/text/306/208</w:t>
+        </w:r>
+      </w:hyperlink>
+    </w:p>
+    <w:p>
+      <w:pPr>
+        <w:numPr>
+          <w:ilvl w:val="0"/>
+          <w:numId w:val="12"/>
+        </w:numPr>
+        <w:spacing w:after="60"/>
+        <w:ind w:left="720" w:hanging="360"/>
+        <w:rPr>
+          <w:rFonts w:ascii="Old Standard TT" w:cs="Old Standard TT" w:eastAsia="Old Standard TT" w:hAnsi="Old Standard TT"/>
+        </w:rPr>
+      </w:pPr>
+      <w:r>
+        <w:rPr>
+          <w:rFonts w:ascii="Old Standard TT" w:cs="Old Standard TT" w:eastAsia="Old Standard TT" w:hAnsi="Old Standard TT"/>
+        </w:rPr>
+        <w:t xml:space="preserve">Court of Justice of the European Union. 2016-01-21. </w:t>
+      </w:r>
+      <w:r>
+        <w:rPr>
+          <w:rFonts w:ascii="Old Standard TT" w:cs="Old Standard TT" w:eastAsia="Old Standard TT" w:hAnsi="Old Standard TT"/>
+          <w:i/>
+          <w:iCs/>
+        </w:rPr>
+        <w:t xml:space="preserve">Eturas and Others</w:t>
+      </w:r>
+      <w:r>
+        <w:rPr>
+          <w:rFonts w:ascii="Old Standard TT" w:cs="Old Standard TT" w:eastAsia="Old Standard TT" w:hAnsi="Old Standard TT"/>
+        </w:rPr>
+        <w:t xml:space="preserve">, Case C-74/14, CELEX 62014CJ0074. </w:t>
+      </w:r>
+      <w:hyperlink r:id="rId21">
+        <w:r>
+          <w:rPr>
+            <w:rFonts w:ascii="Old Standard TT" w:cs="Old Standard TT" w:eastAsia="Old Standard TT" w:hAnsi="Old Standard TT"/>
+            <w:color w:val="1155cc"/>
+            <w:u w:val="single"/>
+          </w:rPr>
+          <w:t xml:space="preserve">https://eur-lex.europa.eu/legal-content/EN/TXT/?uri=CELEX:62014CJ0074</w:t>
+        </w:r>
+      </w:hyperlink>
+    </w:p>
+    <w:p>
+      <w:pPr>
+        <w:numPr>
+          <w:ilvl w:val="0"/>
+          <w:numId w:val="12"/>
+        </w:numPr>
+        <w:spacing w:after="60"/>
+        <w:ind w:left="720" w:hanging="360"/>
+        <w:rPr>
+          <w:rFonts w:ascii="Old Standard TT" w:cs="Old Standard TT" w:eastAsia="Old Standard TT" w:hAnsi="Old Standard TT"/>
+        </w:rPr>
+      </w:pPr>
+      <w:r>
+        <w:rPr>
+          <w:rFonts w:ascii="Old Standard TT" w:cs="Old Standard TT" w:eastAsia="Old Standard TT" w:hAnsi="Old Standard TT"/>
+          <w:i/>
+          <w:iCs/>
+        </w:rPr>
+        <w:t xml:space="preserve">Gibson v. Cendyn Group, LLC</w:t>
+      </w:r>
+      <w:r>
+        <w:rPr>
+          <w:rFonts w:ascii="Old Standard TT" w:cs="Old Standard TT" w:eastAsia="Old Standard TT" w:hAnsi="Old Standard TT"/>
+        </w:rPr>
+        <w:t xml:space="preserve">, No. 24-3576 (9th Cir. 2025-08-15). </w:t>
+      </w:r>
+      <w:hyperlink r:id="rId22">
+        <w:r>
+          <w:rPr>
+            <w:rFonts w:ascii="Old Standard TT" w:cs="Old Standard TT" w:eastAsia="Old Standard TT" w:hAnsi="Old Standard TT"/>
+            <w:color w:val="1155cc"/>
+            <w:u w:val="single"/>
+          </w:rPr>
+          <w:t xml:space="preserve">https://cdn.ca9.uscourts.gov/datastore/opinions/2025/08/15/24-3576.pdf</w:t>
+        </w:r>
+      </w:hyperlink>
+    </w:p>
+    <w:p>
+      <w:pPr>
+        <w:numPr>
+          <w:ilvl w:val="0"/>
+          <w:numId w:val="12"/>
+        </w:numPr>
+        <w:spacing w:after="60"/>
+        <w:ind w:left="720" w:hanging="360"/>
+        <w:rPr>
+          <w:rFonts w:ascii="Old Standard TT" w:cs="Old Standard TT" w:eastAsia="Old Standard TT" w:hAnsi="Old Standard TT"/>
+        </w:rPr>
+      </w:pPr>
+      <w:r>
+        <w:rPr>
+          <w:rFonts w:ascii="Old Standard TT" w:cs="Old Standard TT" w:eastAsia="Old Standard TT" w:hAnsi="Old Standard TT"/>
+        </w:rPr>
+        <w:t xml:space="preserve">Berger et al. 2025. </w:t>
+      </w:r>
+      <w:r>
+        <w:rPr>
+          <w:rFonts w:ascii="Old Standard TT" w:cs="Old Standard TT" w:eastAsia="Old Standard TT" w:hAnsi="Old Standard TT"/>
+          <w:i/>
+          <w:iCs/>
+        </w:rPr>
+        <w:t xml:space="preserve">ABA Antitrust Law</w:t>
+      </w:r>
+      <w:r>
+        <w:rPr>
+          <w:rFonts w:ascii="Old Standard TT" w:cs="Old Standard TT" w:eastAsia="Old Standard TT" w:hAnsi="Old Standard TT"/>
+        </w:rPr>
+        <w:t xml:space="preserve"> magazine, Fall 2025. </w:t>
+      </w:r>
+      <w:r>
+        <w:rPr>
+          <w:rFonts w:ascii="Old Standard TT" w:cs="Old Standard TT" w:eastAsia="Old Standard TT" w:hAnsi="Old Standard TT"/>
+          <w:highlight w:val="yellow"/>
+        </w:rPr>
+        <w:t xml:space="preserve">[AUTHOR:</w:t>
+      </w:r>
+      <w:r>
+        <w:rPr>
+          <w:rFonts w:ascii="Old Standard TT" w:cs="Old Standard TT" w:eastAsia="Old Standard TT" w:hAnsi="Old Standard TT"/>
+          <w:highlight w:val="yellow"/>
+        </w:rPr>
+        <w:t xml:space="preserve"> open the link and copy the exact title and authors.</w:t>
+      </w:r>
+      <w:r>
+        <w:rPr>
+          <w:rFonts w:ascii="Old Standard TT" w:cs="Old Standard TT" w:eastAsia="Old Standard TT" w:hAnsi="Old Standard TT"/>
+          <w:highlight w:val="yellow"/>
+        </w:rPr>
+        <w:t xml:space="preserve">]</w:t>
+      </w:r>
+      <w:r>
+        <w:rPr>
+          <w:rFonts w:ascii="Old Standard TT" w:cs="Old Standard TT" w:eastAsia="Old Standard TT" w:hAnsi="Old Standard TT"/>
+        </w:rPr>
+        <w:t xml:space="preserve"> </w:t>
+      </w:r>
+      <w:hyperlink r:id="rId23">
+        <w:r>
+          <w:rPr>
+            <w:rFonts w:ascii="Old Standard TT" w:cs="Old Standard TT" w:eastAsia="Old Standard TT" w:hAnsi="Old Standard TT"/>
+            <w:color w:val="1155cc"/>
+            <w:u w:val="single"/>
+          </w:rPr>
+          <w:t xml:space="preserve">https://www.americanbar.org/groups/antitrust_law/resources/magazine/2025-fall/coordination-code-rethinking-antitrust-liability-age-ai-pricing/</w:t>
+        </w:r>
+      </w:hyperlink>
+    </w:p>
+    <w:p>
+      <w:pPr>
+        <w:numPr>
+          <w:ilvl w:val="0"/>
+          <w:numId w:val="12"/>
+        </w:numPr>
+        <w:spacing w:after="60"/>
+        <w:ind w:left="720" w:hanging="360"/>
+        <w:rPr>
+          <w:rFonts w:ascii="Old Standard TT" w:cs="Old Standard TT" w:eastAsia="Old Standard TT" w:hAnsi="Old Standard TT"/>
+        </w:rPr>
+      </w:pPr>
+      <w:r>
+        <w:rPr>
+          <w:rFonts w:ascii="Old Standard TT" w:cs="Old Standard TT" w:eastAsia="Old Standard TT" w:hAnsi="Old Standard TT"/>
+        </w:rPr>
+        <w:t xml:space="preserve">Bikhchandani, S., Hirshleifer, D., and Welch, I. 1992. A Theory of Fads, Fashion, Custom, and Cultural Change as Informational Cascades. </w:t>
+      </w:r>
+      <w:r>
+        <w:rPr>
+          <w:rFonts w:ascii="Old Standard TT" w:cs="Old Standard TT" w:eastAsia="Old Standard TT" w:hAnsi="Old Standard TT"/>
+          <w:i/>
+          <w:iCs/>
+        </w:rPr>
         <w:t xml:space="preserve">Journal of Political Economy</w:t>
       </w:r>
       <w:r>
@@ -14236,7 +14502,7 @@
         </w:rPr>
         <w:t xml:space="preserve"> 100(5), 992-1026. </w:t>
       </w:r>
-      <w:hyperlink r:id="rId15">
+      <w:hyperlink r:id="rId24">
         <w:r>
           <w:rPr>
             <w:rFonts w:ascii="Old Standard TT" w:cs="Old Standard TT" w:eastAsia="Old Standard TT" w:hAnsi="Old Standard TT"/>
@@ -14251,7 +14517,7 @@
       <w:pPr>
         <w:numPr>
           <w:ilvl w:val="0"/>
-          <w:numId w:val="3"/>
+          <w:numId w:val="12"/>
         </w:numPr>
         <w:spacing w:after="60"/>
         <w:ind w:left="720" w:hanging="360"/>
@@ -14263,7 +14529,7 @@
         <w:rPr>
           <w:rFonts w:ascii="Old Standard TT" w:cs="Old Standard TT" w:eastAsia="Old Standard TT" w:hAnsi="Old Standard TT"/>
         </w:rPr>
-        <w:t xml:space="preserve">[R7] Crawford, V. P., and Sobel, J. 1982. Strategic Information Transmission. </w:t>
+        <w:t xml:space="preserve">Crawford, V. P., and Sobel, J. 1982. Strategic Information Transmission. </w:t>
       </w:r>
       <w:r>
         <w:rPr>
@@ -14279,7 +14545,7 @@
         </w:rPr>
         <w:t xml:space="preserve"> 50(6), 1431-1451. </w:t>
       </w:r>
-      <w:hyperlink r:id="rId16">
+      <w:hyperlink r:id="rId25">
         <w:r>
           <w:rPr>
             <w:rFonts w:ascii="Old Standard TT" w:cs="Old Standard TT" w:eastAsia="Old Standard TT" w:hAnsi="Old Standard TT"/>
@@ -14294,7 +14560,7 @@
       <w:pPr>
         <w:numPr>
           <w:ilvl w:val="0"/>
-          <w:numId w:val="3"/>
+          <w:numId w:val="12"/>
         </w:numPr>
         <w:spacing w:after="60"/>
         <w:ind w:left="720" w:hanging="360"/>
@@ -14306,7 +14572,7 @@
         <w:rPr>
           <w:rFonts w:ascii="Old Standard TT" w:cs="Old Standard TT" w:eastAsia="Old Standard TT" w:hAnsi="Old Standard TT"/>
         </w:rPr>
-        <w:t xml:space="preserve">[R8] Kamenica, E., and Gentzkow, M. 2011. Bayesian Persuasion. </w:t>
+        <w:t xml:space="preserve">Kamenica, E., and Gentzkow, M. 2011. Bayesian Persuasion. </w:t>
       </w:r>
       <w:r>
         <w:rPr>
@@ -14322,7 +14588,7 @@
         </w:rPr>
         <w:t xml:space="preserve"> 101(6), 2590-2615. </w:t>
       </w:r>
-      <w:hyperlink r:id="rId17">
+      <w:hyperlink r:id="rId26">
         <w:r>
           <w:rPr>
             <w:rFonts w:ascii="Old Standard TT" w:cs="Old Standard TT" w:eastAsia="Old Standard TT" w:hAnsi="Old Standard TT"/>
@@ -14337,7 +14603,7 @@
       <w:pPr>
         <w:numPr>
           <w:ilvl w:val="0"/>
-          <w:numId w:val="3"/>
+          <w:numId w:val="12"/>
         </w:numPr>
         <w:spacing w:after="60"/>
         <w:ind w:left="720" w:hanging="360"/>
@@ -14349,7 +14615,7 @@
         <w:rPr>
           <w:rFonts w:ascii="Old Standard TT" w:cs="Old Standard TT" w:eastAsia="Old Standard TT" w:hAnsi="Old Standard TT"/>
         </w:rPr>
-        <w:t xml:space="preserve">[R11] Greenblatt, R., Shlegeris, B., Sachan, K., and Roger, F. 2024. AI Control: Improving Safety Despite Intentional Subversion. </w:t>
+        <w:t xml:space="preserve">Okawa, M. 2026. Emergence of Biased Consensus in Multi-Agent LLM Debates. </w:t>
       </w:r>
       <w:r>
         <w:rPr>
@@ -14357,6 +14623,193 @@
           <w:i/>
           <w:iCs/>
         </w:rPr>
+        <w:t xml:space="preserve">ICML 2026</w:t>
+      </w:r>
+      <w:r>
+        <w:rPr>
+          <w:rFonts w:ascii="Old Standard TT" w:cs="Old Standard TT" w:eastAsia="Old Standard TT" w:hAnsi="Old Standard TT"/>
+        </w:rPr>
+        <w:t xml:space="preserve">, PMLR 306. </w:t>
+      </w:r>
+      <w:hyperlink r:id="rId27">
+        <w:r>
+          <w:rPr>
+            <w:rFonts w:ascii="Old Standard TT" w:cs="Old Standard TT" w:eastAsia="Old Standard TT" w:hAnsi="Old Standard TT"/>
+            <w:color w:val="1155cc"/>
+            <w:u w:val="single"/>
+          </w:rPr>
+          <w:t xml:space="preserve">https://proceedings.mlr.press/v306/okawa26a.html</w:t>
+        </w:r>
+      </w:hyperlink>
+    </w:p>
+    <w:p>
+      <w:pPr>
+        <w:numPr>
+          <w:ilvl w:val="0"/>
+          <w:numId w:val="12"/>
+        </w:numPr>
+        <w:spacing w:after="60"/>
+        <w:ind w:left="720" w:hanging="360"/>
+        <w:rPr>
+          <w:rFonts w:ascii="Old Standard TT" w:cs="Old Standard TT" w:eastAsia="Old Standard TT" w:hAnsi="Old Standard TT"/>
+        </w:rPr>
+      </w:pPr>
+      <w:r>
+        <w:rPr>
+          <w:rFonts w:ascii="Old Standard TT" w:cs="Old Standard TT" w:eastAsia="Old Standard TT" w:hAnsi="Old Standard TT"/>
+        </w:rPr>
+        <w:t xml:space="preserve">Motwani, S. R., et al. 2024. Secret Collusion among AI Agents: Multi-Agent Deception via Steganography. </w:t>
+      </w:r>
+      <w:r>
+        <w:rPr>
+          <w:rFonts w:ascii="Old Standard TT" w:cs="Old Standard TT" w:eastAsia="Old Standard TT" w:hAnsi="Old Standard TT"/>
+          <w:i/>
+          <w:iCs/>
+        </w:rPr>
+        <w:t xml:space="preserve">NeurIPS 2024</w:t>
+      </w:r>
+      <w:r>
+        <w:rPr>
+          <w:rFonts w:ascii="Old Standard TT" w:cs="Old Standard TT" w:eastAsia="Old Standard TT" w:hAnsi="Old Standard TT"/>
+        </w:rPr>
+        <w:t xml:space="preserve">. </w:t>
+      </w:r>
+      <w:hyperlink r:id="rId28">
+        <w:r>
+          <w:rPr>
+            <w:rFonts w:ascii="Old Standard TT" w:cs="Old Standard TT" w:eastAsia="Old Standard TT" w:hAnsi="Old Standard TT"/>
+            <w:color w:val="1155cc"/>
+            <w:u w:val="single"/>
+          </w:rPr>
+          <w:t xml:space="preserve">https://proceedings.neurips.cc/paper_files/paper/2024/hash/861f7dad098aec1c3560fb7add468d41-Abstract-Conference.html</w:t>
+        </w:r>
+      </w:hyperlink>
+    </w:p>
+    <w:p>
+      <w:pPr>
+        <w:numPr>
+          <w:ilvl w:val="0"/>
+          <w:numId w:val="12"/>
+        </w:numPr>
+        <w:spacing w:after="60"/>
+        <w:ind w:left="720" w:hanging="360"/>
+        <w:rPr>
+          <w:rFonts w:ascii="Old Standard TT" w:cs="Old Standard TT" w:eastAsia="Old Standard TT" w:hAnsi="Old Standard TT"/>
+        </w:rPr>
+      </w:pPr>
+      <w:r>
+        <w:rPr>
+          <w:rFonts w:ascii="Old Standard TT" w:cs="Old Standard TT" w:eastAsia="Old Standard TT" w:hAnsi="Old Standard TT"/>
+        </w:rPr>
+        <w:t xml:space="preserve">Nakamura, M., Kumar, A., Das, S., Abdelnabi, S., Mahmud, S., Fioretto, F., Zilberstein, S., and Bagdasarian, E. 2026. Colosseum: Auditing Collusion in Cooperative Multi-Agent Systems. arXiv:2602.15198. </w:t>
+      </w:r>
+      <w:hyperlink r:id="rId29">
+        <w:r>
+          <w:rPr>
+            <w:rFonts w:ascii="Old Standard TT" w:cs="Old Standard TT" w:eastAsia="Old Standard TT" w:hAnsi="Old Standard TT"/>
+            <w:color w:val="1155cc"/>
+            <w:u w:val="single"/>
+          </w:rPr>
+          <w:t xml:space="preserve">https://arxiv.org/abs/2602.15198</w:t>
+        </w:r>
+      </w:hyperlink>
+    </w:p>
+    <w:p>
+      <w:pPr>
+        <w:numPr>
+          <w:ilvl w:val="0"/>
+          <w:numId w:val="12"/>
+        </w:numPr>
+        <w:spacing w:after="60"/>
+        <w:ind w:left="720" w:hanging="360"/>
+        <w:rPr>
+          <w:rFonts w:ascii="Old Standard TT" w:cs="Old Standard TT" w:eastAsia="Old Standard TT" w:hAnsi="Old Standard TT"/>
+        </w:rPr>
+      </w:pPr>
+      <w:r>
+        <w:rPr>
+          <w:rFonts w:ascii="Old Standard TT" w:cs="Old Standard TT" w:eastAsia="Old Standard TT" w:hAnsi="Old Standard TT"/>
+        </w:rPr>
+        <w:t xml:space="preserve">Hu, J., Huang, X., Sun, Y., Dong, Y., and Huang, X. 2026. Lying with Truths: Open-Channel Multi-Agent Collusion for Belief Manipulation via Generative Montage. </w:t>
+      </w:r>
+      <w:r>
+        <w:rPr>
+          <w:rFonts w:ascii="Old Standard TT" w:cs="Old Standard TT" w:eastAsia="Old Standard TT" w:hAnsi="Old Standard TT"/>
+          <w:i/>
+          <w:iCs/>
+        </w:rPr>
+        <w:t xml:space="preserve">ACL 2026</w:t>
+      </w:r>
+      <w:r>
+        <w:rPr>
+          <w:rFonts w:ascii="Old Standard TT" w:cs="Old Standard TT" w:eastAsia="Old Standard TT" w:hAnsi="Old Standard TT"/>
+        </w:rPr>
+        <w:t xml:space="preserve">. </w:t>
+      </w:r>
+      <w:hyperlink r:id="rId30">
+        <w:r>
+          <w:rPr>
+            <w:rFonts w:ascii="Old Standard TT" w:cs="Old Standard TT" w:eastAsia="Old Standard TT" w:hAnsi="Old Standard TT"/>
+            <w:color w:val="1155cc"/>
+            <w:u w:val="single"/>
+          </w:rPr>
+          <w:t xml:space="preserve">https://aclanthology.org/2026.acl-long.270/</w:t>
+        </w:r>
+      </w:hyperlink>
+    </w:p>
+    <w:p>
+      <w:pPr>
+        <w:numPr>
+          <w:ilvl w:val="0"/>
+          <w:numId w:val="12"/>
+        </w:numPr>
+        <w:spacing w:after="60"/>
+        <w:ind w:left="720" w:hanging="360"/>
+        <w:rPr>
+          <w:rFonts w:ascii="Old Standard TT" w:cs="Old Standard TT" w:eastAsia="Old Standard TT" w:hAnsi="Old Standard TT"/>
+        </w:rPr>
+      </w:pPr>
+      <w:r>
+        <w:rPr>
+          <w:rFonts w:ascii="Old Standard TT" w:cs="Old Standard TT" w:eastAsia="Old Standard TT" w:hAnsi="Old Standard TT"/>
+        </w:rPr>
+        <w:t xml:space="preserve">Rose, A., Cullen, C., Abdelnabi, S., Torr, P., Kaplowitz, B. G., and Schroeder de Witt, C. 2026. Detecting Multi-Agent Collusion Through Multi-Agent Interpretability. arXiv:2604.01151. </w:t>
+      </w:r>
+      <w:hyperlink r:id="rId31">
+        <w:r>
+          <w:rPr>
+            <w:rFonts w:ascii="Old Standard TT" w:cs="Old Standard TT" w:eastAsia="Old Standard TT" w:hAnsi="Old Standard TT"/>
+            <w:color w:val="1155cc"/>
+            <w:u w:val="single"/>
+          </w:rPr>
+          <w:t xml:space="preserve">https://arxiv.org/abs/2604.01151</w:t>
+        </w:r>
+      </w:hyperlink>
+    </w:p>
+    <w:p>
+      <w:pPr>
+        <w:numPr>
+          <w:ilvl w:val="0"/>
+          <w:numId w:val="12"/>
+        </w:numPr>
+        <w:spacing w:after="60"/>
+        <w:ind w:left="720" w:hanging="360"/>
+        <w:rPr>
+          <w:rFonts w:ascii="Old Standard TT" w:cs="Old Standard TT" w:eastAsia="Old Standard TT" w:hAnsi="Old Standard TT"/>
+        </w:rPr>
+      </w:pPr>
+      <w:r>
+        <w:rPr>
+          <w:rFonts w:ascii="Old Standard TT" w:cs="Old Standard TT" w:eastAsia="Old Standard TT" w:hAnsi="Old Standard TT"/>
+        </w:rPr>
+        <w:t xml:space="preserve">Greenblatt, R., Shlegeris, B., Sachan, K., and Roger, F. 2024. AI Control: Improving Safety Despite Intentional Subversion. </w:t>
+      </w:r>
+      <w:r>
+        <w:rPr>
+          <w:rFonts w:ascii="Old Standard TT" w:cs="Old Standard TT" w:eastAsia="Old Standard TT" w:hAnsi="Old Standard TT"/>
+          <w:i/>
+          <w:iCs/>
+        </w:rPr>
         <w:t xml:space="preserve">ICML 2024</w:t>
       </w:r>
       <w:r>
@@ -14365,7 +14818,7 @@
         </w:rPr>
         <w:t xml:space="preserve">, PMLR 235. </w:t>
       </w:r>
-      <w:hyperlink r:id="rId18">
+      <w:hyperlink r:id="rId32">
         <w:r>
           <w:rPr>
             <w:rFonts w:ascii="Old Standard TT" w:cs="Old Standard TT" w:eastAsia="Old Standard TT" w:hAnsi="Old Standard TT"/>
@@ -14378,6 +14831,115 @@
     </w:p>
     <w:p>
       <w:pPr>
+        <w:pStyle w:val="Heading2"/>
+        <w:spacing w:after="0" w:before="200" w:line="360" w:lineRule="auto"/>
+        <w:rPr>
+          <w:rFonts w:ascii="Old Standard TT" w:cs="Old Standard TT" w:eastAsia="Old Standard TT" w:hAnsi="Old Standard TT"/>
+          <w:b/>
+          <w:bCs/>
+          <w:sz w:val="28"/>
+          <w:szCs w:val="28"/>
+        </w:rPr>
+      </w:pPr>
+      <w:r>
+        <w:rPr>
+          <w:rFonts w:ascii="Old Standard TT" w:cs="Old Standard TT" w:eastAsia="Old Standard TT" w:hAnsi="Old Standard TT"/>
+          <w:b/>
+          <w:bCs/>
+          <w:sz w:val="28"/>
+          <w:szCs w:val="28"/>
+        </w:rPr>
+        <w:t xml:space="preserve">Appendix A. Limitations and Dual-Use / Ethical Considerations</w:t>
+      </w:r>
+    </w:p>
+    <w:p>
+      <w:pPr>
+        <w:pStyle w:val="Heading3"/>
+        <w:spacing w:before="200" w:lineRule="auto"/>
+        <w:rPr>
+          <w:rFonts w:ascii="Old Standard TT" w:cs="Old Standard TT" w:eastAsia="Old Standard TT" w:hAnsi="Old Standard TT"/>
+          <w:b/>
+          <w:bCs/>
+          <w:color w:val="000000"/>
+          <w:sz w:val="26"/>
+          <w:szCs w:val="26"/>
+        </w:rPr>
+      </w:pPr>
+      <w:r>
+        <w:rPr>
+          <w:rFonts w:ascii="Old Standard TT" w:cs="Old Standard TT" w:eastAsia="Old Standard TT" w:hAnsi="Old Standard TT"/>
+          <w:b/>
+          <w:bCs/>
+          <w:color w:val="000000"/>
+          <w:sz w:val="26"/>
+          <w:szCs w:val="26"/>
+        </w:rPr>
+        <w:t xml:space="preserve">What this result does and does not establish</w:t>
+      </w:r>
+    </w:p>
+    <w:p>
+      <w:pPr>
+        <w:spacing w:after="120"/>
+        <w:rPr>
+          <w:rFonts w:ascii="Old Standard TT" w:cs="Old Standard TT" w:eastAsia="Old Standard TT" w:hAnsi="Old Standard TT"/>
+        </w:rPr>
+      </w:pPr>
+      <w:r>
+        <w:rPr>
+          <w:rFonts w:ascii="Old Standard TT" w:cs="Old Standard TT" w:eastAsia="Old Standard TT" w:hAnsi="Old Standard TT"/>
+          <w:b/>
+          <w:bCs/>
+        </w:rPr>
+        <w:t xml:space="preserve">It establishes</w:t>
+      </w:r>
+      <w:r>
+        <w:rPr>
+          <w:rFonts w:ascii="Old Standard TT" w:cs="Old Standard TT" w:eastAsia="Old Standard TT" w:hAnsi="Old Standard TT"/>
+        </w:rPr>
+        <w:t xml:space="preserve"> four things, for seven language models under one set of role prompts. A private channel did not raise the rate of false approvals. Written agreement and refusal did not predict endorsements. Provenance discounts had almost no false positives to remove. Two language-model judges disagree about which records show collusion. </w:t>
+      </w:r>
+      <w:r>
+        <w:rPr>
+          <w:rFonts w:ascii="Old Standard TT" w:cs="Old Standard TT" w:eastAsia="Old Standard TT" w:hAnsi="Old Standard TT"/>
+          <w:b/>
+          <w:bCs/>
+        </w:rPr>
+        <w:t xml:space="preserve">It does not establish</w:t>
+      </w:r>
+      <w:r>
+        <w:rPr>
+          <w:rFonts w:ascii="Old Standard TT" w:cs="Old Standard TT" w:eastAsia="Old Standard TT" w:hAnsi="Old Standard TT"/>
+        </w:rPr>
+        <w:t xml:space="preserve"> how models with trained goals would act. It does not show how the same models act under other prompts. It does not show whether any auditor can detect a coalition that coordinates without text. The one real case was caught only with a twin record that no deployed auditor has.</w:t>
+      </w:r>
+    </w:p>
+    <w:p>
+      <w:pPr>
+        <w:pStyle w:val="Heading3"/>
+        <w:spacing w:before="200" w:lineRule="auto"/>
+        <w:rPr>
+          <w:rFonts w:ascii="Old Standard TT" w:cs="Old Standard TT" w:eastAsia="Old Standard TT" w:hAnsi="Old Standard TT"/>
+          <w:b/>
+          <w:bCs/>
+          <w:color w:val="000000"/>
+          <w:sz w:val="26"/>
+          <w:szCs w:val="26"/>
+        </w:rPr>
+      </w:pPr>
+      <w:r>
+        <w:rPr>
+          <w:rFonts w:ascii="Old Standard TT" w:cs="Old Standard TT" w:eastAsia="Old Standard TT" w:hAnsi="Old Standard TT"/>
+          <w:b/>
+          <w:bCs/>
+          <w:color w:val="000000"/>
+          <w:sz w:val="26"/>
+          <w:szCs w:val="26"/>
+        </w:rPr>
+        <w:t xml:space="preserve">Limitations</w:t>
+      </w:r>
+    </w:p>
+    <w:p>
+      <w:pPr>
         <w:numPr>
           <w:ilvl w:val="0"/>
           <w:numId w:val="3"/>
@@ -14391,33 +14953,17 @@
       <w:r>
         <w:rPr>
           <w:rFonts w:ascii="Old Standard TT" w:cs="Old Standard TT" w:eastAsia="Old Standard TT" w:hAnsi="Old Standard TT"/>
-        </w:rPr>
-        <w:t xml:space="preserve">[R12] Motwani, S. R., et al. 2024. Secret Collusion among AI Agents: Multi-Agent Deception via Steganography. </w:t>
-      </w:r>
-      <w:r>
-        <w:rPr>
-          <w:rFonts w:ascii="Old Standard TT" w:cs="Old Standard TT" w:eastAsia="Old Standard TT" w:hAnsi="Old Standard TT"/>
-          <w:i/>
-          <w:iCs/>
-        </w:rPr>
-        <w:t xml:space="preserve">NeurIPS 2024</w:t>
-      </w:r>
-      <w:r>
-        <w:rPr>
-          <w:rFonts w:ascii="Old Standard TT" w:cs="Old Standard TT" w:eastAsia="Old Standard TT" w:hAnsi="Old Standard TT"/>
-        </w:rPr>
-        <w:t xml:space="preserve">. </w:t>
-      </w:r>
-      <w:hyperlink r:id="rId19">
-        <w:r>
-          <w:rPr>
-            <w:rFonts w:ascii="Old Standard TT" w:cs="Old Standard TT" w:eastAsia="Old Standard TT" w:hAnsi="Old Standard TT"/>
-            <w:color w:val="1155cc"/>
-            <w:u w:val="single"/>
-          </w:rPr>
-          <w:t xml:space="preserve">https://proceedings.neurips.cc/paper_files/paper/2024/hash/861f7dad098aec1c3560fb7add468d41-Abstract-Conference.html</w:t>
-        </w:r>
-      </w:hyperlink>
+          <w:b/>
+          <w:bCs/>
+        </w:rPr>
+        <w:t xml:space="preserve">Prompt-conditioned behavior.</w:t>
+      </w:r>
+      <w:r>
+        <w:rPr>
+          <w:rFonts w:ascii="Old Standard TT" w:cs="Old Standard TT" w:eastAsia="Old Standard TT" w:hAnsi="Old Standard TT"/>
+        </w:rPr>
+        <w:t xml:space="preserve"> The prompts state the payoffs. The results show how seven models behave under these role prompts. They do not show learned objectives.</w:t>
+      </w:r>
     </w:p>
     <w:p>
       <w:pPr>
@@ -14434,33 +14980,17 @@
       <w:r>
         <w:rPr>
           <w:rFonts w:ascii="Old Standard TT" w:cs="Old Standard TT" w:eastAsia="Old Standard TT" w:hAnsi="Old Standard TT"/>
-        </w:rPr>
-        <w:t xml:space="preserve">[R14] Hu, J., Huang, X., Sun, Y., Dong, Y., and Huang, X. 2026. Lying with Truths: Open-Channel Multi-Agent Collusion for Belief Manipulation via Generative Montage. </w:t>
-      </w:r>
-      <w:r>
-        <w:rPr>
-          <w:rFonts w:ascii="Old Standard TT" w:cs="Old Standard TT" w:eastAsia="Old Standard TT" w:hAnsi="Old Standard TT"/>
-          <w:i/>
-          <w:iCs/>
-        </w:rPr>
-        <w:t xml:space="preserve">ACL 2026</w:t>
-      </w:r>
-      <w:r>
-        <w:rPr>
-          <w:rFonts w:ascii="Old Standard TT" w:cs="Old Standard TT" w:eastAsia="Old Standard TT" w:hAnsi="Old Standard TT"/>
-        </w:rPr>
-        <w:t xml:space="preserve">. </w:t>
-      </w:r>
-      <w:hyperlink r:id="rId20">
-        <w:r>
-          <w:rPr>
-            <w:rFonts w:ascii="Old Standard TT" w:cs="Old Standard TT" w:eastAsia="Old Standard TT" w:hAnsi="Old Standard TT"/>
-            <w:color w:val="1155cc"/>
-            <w:u w:val="single"/>
-          </w:rPr>
-          <w:t xml:space="preserve">https://aclanthology.org/2026.acl-long.270/</w:t>
-        </w:r>
-      </w:hyperlink>
+          <w:b/>
+          <w:bCs/>
+        </w:rPr>
+        <w:t xml:space="preserve">One prompt set and one game.</w:t>
+      </w:r>
+      <w:r>
+        <w:rPr>
+          <w:rFonts w:ascii="Old Standard TT" w:cs="Old Standard TT" w:eastAsia="Old Standard TT" w:hAnsi="Old Standard TT"/>
+        </w:rPr>
+        <w:t xml:space="preserve"> I used one set of prompts, one game, and 24 fictional cases. Other prompts can give different results.</w:t>
+      </w:r>
     </w:p>
     <w:p>
       <w:pPr>
@@ -14477,33 +15007,17 @@
       <w:r>
         <w:rPr>
           <w:rFonts w:ascii="Old Standard TT" w:cs="Old Standard TT" w:eastAsia="Old Standard TT" w:hAnsi="Old Standard TT"/>
-        </w:rPr>
-        <w:t xml:space="preserve">[R15] Okawa, M. 2026. Emergence of Biased Consensus in Multi-Agent LLM Debates. </w:t>
-      </w:r>
-      <w:r>
-        <w:rPr>
-          <w:rFonts w:ascii="Old Standard TT" w:cs="Old Standard TT" w:eastAsia="Old Standard TT" w:hAnsi="Old Standard TT"/>
-          <w:i/>
-          <w:iCs/>
-        </w:rPr>
-        <w:t xml:space="preserve">ICML 2026</w:t>
-      </w:r>
-      <w:r>
-        <w:rPr>
-          <w:rFonts w:ascii="Old Standard TT" w:cs="Old Standard TT" w:eastAsia="Old Standard TT" w:hAnsi="Old Standard TT"/>
-        </w:rPr>
-        <w:t xml:space="preserve">, PMLR 306. </w:t>
-      </w:r>
-      <w:hyperlink r:id="rId21">
-        <w:r>
-          <w:rPr>
-            <w:rFonts w:ascii="Old Standard TT" w:cs="Old Standard TT" w:eastAsia="Old Standard TT" w:hAnsi="Old Standard TT"/>
-            <w:color w:val="1155cc"/>
-            <w:u w:val="single"/>
-          </w:rPr>
-          <w:t xml:space="preserve">https://proceedings.mlr.press/v306/okawa26a.html</w:t>
-        </w:r>
-      </w:hyperlink>
+          <w:b/>
+          <w:bCs/>
+        </w:rPr>
+        <w:t xml:space="preserve">Small samples.</w:t>
+      </w:r>
+      <w:r>
+        <w:rPr>
+          <w:rFonts w:ascii="Old Standard TT" w:cs="Old Standard TT" w:eastAsia="Old Standard TT" w:hAnsi="Old Standard TT"/>
+        </w:rPr>
+        <w:t xml:space="preserve"> Each false approval rate uses 18 false-claim trajectories. The intervals are wide.</w:t>
+      </w:r>
     </w:p>
     <w:p>
       <w:pPr>
@@ -14520,19 +15034,17 @@
       <w:r>
         <w:rPr>
           <w:rFonts w:ascii="Old Standard TT" w:cs="Old Standard TT" w:eastAsia="Old Standard TT" w:hAnsi="Old Standard TT"/>
-        </w:rPr>
-        <w:t xml:space="preserve">[R17] Rose, A., Cullen, C., Abdelnabi, S., Torr, P., Kaplowitz, B. G., and Schroeder de Witt, C. 2026. Detecting Multi-Agent Collusion Through Multi-Agent Interpretability. arXiv:2604.01151. </w:t>
-      </w:r>
-      <w:hyperlink r:id="rId22">
-        <w:r>
-          <w:rPr>
-            <w:rFonts w:ascii="Old Standard TT" w:cs="Old Standard TT" w:eastAsia="Old Standard TT" w:hAnsi="Old Standard TT"/>
-            <w:color w:val="1155cc"/>
-            <w:u w:val="single"/>
-          </w:rPr>
-          <w:t xml:space="preserve">https://arxiv.org/abs/2604.01151</w:t>
-        </w:r>
-      </w:hyperlink>
+          <w:b/>
+          <w:bCs/>
+        </w:rPr>
+        <w:t xml:space="preserve">Seeds are not fully independent.</w:t>
+      </w:r>
+      <w:r>
+        <w:rPr>
+          <w:rFonts w:ascii="Old Standard TT" w:cs="Old Standard TT" w:eastAsia="Old Standard TT" w:hAnsi="Old Standard TT"/>
+        </w:rPr>
+        <w:t xml:space="preserve"> About one call in six came from the local cache, because two seeds gave an identical prompt. Some seeds repeat earlier answers.</w:t>
+      </w:r>
     </w:p>
     <w:p>
       <w:pPr>
@@ -14549,19 +15061,17 @@
       <w:r>
         <w:rPr>
           <w:rFonts w:ascii="Old Standard TT" w:cs="Old Standard TT" w:eastAsia="Old Standard TT" w:hAnsi="Old Standard TT"/>
-        </w:rPr>
-        <w:t xml:space="preserve">[S1] Nakamura, M., Kumar, A., Das, S., Abdelnabi, S., Mahmud, S., Fioretto, F., Zilberstein, S., and Bagdasarian, E. 2026. Colosseum: Auditing Collusion in Cooperative Multi-Agent Systems. arXiv:2602.15198. </w:t>
-      </w:r>
-      <w:hyperlink r:id="rId23">
-        <w:r>
-          <w:rPr>
-            <w:rFonts w:ascii="Old Standard TT" w:cs="Old Standard TT" w:eastAsia="Old Standard TT" w:hAnsi="Old Standard TT"/>
-            <w:color w:val="1155cc"/>
-            <w:u w:val="single"/>
-          </w:rPr>
-          <w:t xml:space="preserve">https://arxiv.org/abs/2602.15198</w:t>
-        </w:r>
-      </w:hyperlink>
+          <w:b/>
+          <w:bCs/>
+        </w:rPr>
+        <w:t xml:space="preserve">Six models are exploratory.</w:t>
+      </w:r>
+      <w:r>
+        <w:rPr>
+          <w:rFonts w:ascii="Old Standard TT" w:cs="Old Standard TT" w:eastAsia="Old Standard TT" w:hAnsi="Old Standard TT"/>
+        </w:rPr>
+        <w:t xml:space="preserve"> I added them after I saw the DeepSeek chat results. They use a reply limit of 1,500 tokens; DeepSeek chat uses 600. The two DeepSeek V4 models run with thinking disabled. Twenty trajectories failed on network errors, and I ran them again with identical prompts (Appendix C).</w:t>
+      </w:r>
     </w:p>
     <w:p>
       <w:pPr>
@@ -14578,22 +15088,16 @@
       <w:r>
         <w:rPr>
           <w:rFonts w:ascii="Old Standard TT" w:cs="Old Standard TT" w:eastAsia="Old Standard TT" w:hAnsi="Old Standard TT"/>
-        </w:rPr>
-        <w:t xml:space="preserve">[S2] Berger et al. 2025. </w:t>
-      </w:r>
-      <w:r>
-        <w:rPr>
-          <w:rFonts w:ascii="Old Standard TT" w:cs="Old Standard TT" w:eastAsia="Old Standard TT" w:hAnsi="Old Standard TT"/>
-          <w:i/>
-          <w:iCs/>
-        </w:rPr>
-        <w:t xml:space="preserve">ABA Antitrust Law</w:t>
-      </w:r>
-      <w:r>
-        <w:rPr>
-          <w:rFonts w:ascii="Old Standard TT" w:cs="Old Standard TT" w:eastAsia="Old Standard TT" w:hAnsi="Old Standard TT"/>
-        </w:rPr>
-        <w:t xml:space="preserve"> magazine, Fall 2025. </w:t>
+          <w:b/>
+          <w:bCs/>
+        </w:rPr>
+        <w:t xml:space="preserve">The hand classification is limited.</w:t>
+      </w:r>
+      <w:r>
+        <w:rPr>
+          <w:rFonts w:ascii="Old Standard TT" w:cs="Old Standard TT" w:eastAsia="Old Standard TT" w:hAnsi="Old Standard TT"/>
+        </w:rPr>
+        <w:t xml:space="preserve"> The AI assistant classified the E1 trajectories of DeepSeek chat, GPT-5.6 Terra, and DeepSeek Flash. Claude Sonnet and DeepSeek V4 Pro sent no private messages. The assistant read Claude Haiku's 3 messages; I did not classify GPT-5.6 Luna's 36. I spot-checked the tables. </w:t>
       </w:r>
       <w:r>
         <w:rPr>
@@ -14607,7 +15111,7 @@
           <w:rFonts w:ascii="Old Standard TT" w:cs="Old Standard TT" w:eastAsia="Old Standard TT" w:hAnsi="Old Standard TT"/>
           <w:highlight w:val="yellow"/>
         </w:rPr>
-        <w:t xml:space="preserve"> open the link and copy the exact title and authors.</w:t>
+        <w:t xml:space="preserve"> confirm after your spot-check.</w:t>
       </w:r>
       <w:r>
         <w:rPr>
@@ -14616,22 +15120,6 @@
         </w:rPr>
         <w:t xml:space="preserve">]</w:t>
       </w:r>
-      <w:r>
-        <w:rPr>
-          <w:rFonts w:ascii="Old Standard TT" w:cs="Old Standard TT" w:eastAsia="Old Standard TT" w:hAnsi="Old Standard TT"/>
-        </w:rPr>
-        <w:t xml:space="preserve"> </w:t>
-      </w:r>
-      <w:hyperlink r:id="rId24">
-        <w:r>
-          <w:rPr>
-            <w:rFonts w:ascii="Old Standard TT" w:cs="Old Standard TT" w:eastAsia="Old Standard TT" w:hAnsi="Old Standard TT"/>
-            <w:color w:val="1155cc"/>
-            <w:u w:val="single"/>
-          </w:rPr>
-          <w:t xml:space="preserve">https://www.americanbar.org/groups/antitrust_law/resources/magazine/2025-fall/coordination-code-rethinking-antitrust-liability-age-ai-pricing/</w:t>
-        </w:r>
-      </w:hyperlink>
     </w:p>
     <w:p>
       <w:pPr>
@@ -14648,19 +15136,17 @@
       <w:r>
         <w:rPr>
           <w:rFonts w:ascii="Old Standard TT" w:cs="Old Standard TT" w:eastAsia="Old Standard TT" w:hAnsi="Old Standard TT"/>
-        </w:rPr>
-        <w:t xml:space="preserve">[S28] FERC Staff. 2003-08-01. Initial Report on Physical Withholding by Generators in the California Market. </w:t>
-      </w:r>
-      <w:hyperlink r:id="rId25">
-        <w:r>
-          <w:rPr>
-            <w:rFonts w:ascii="Old Standard TT" w:cs="Old Standard TT" w:eastAsia="Old Standard TT" w:hAnsi="Old Standard TT"/>
-            <w:color w:val="1155cc"/>
-            <w:u w:val="single"/>
-          </w:rPr>
-          <w:t xml:space="preserve">https://ferc.gov/sites/default/files/2020-05/WithholdingReport8-1-03.pdf</w:t>
-        </w:r>
-      </w:hyperlink>
+          <w:b/>
+          <w:bCs/>
+        </w:rPr>
+        <w:t xml:space="preserve">The keyword rule is weak.</w:t>
+      </w:r>
+      <w:r>
+        <w:rPr>
+          <w:rFonts w:ascii="Old Standard TT" w:cs="Old Standard TT" w:eastAsia="Old Standard TT" w:hAnsi="Old Standard TT"/>
+        </w:rPr>
+        <w:t xml:space="preserve"> It finds the scripted plan but misses reworded plans. The LLM judge is a complement, with its own biases.</w:t>
+      </w:r>
     </w:p>
     <w:p>
       <w:pPr>
@@ -14677,19 +15163,17 @@
       <w:r>
         <w:rPr>
           <w:rFonts w:ascii="Old Standard TT" w:cs="Old Standard TT" w:eastAsia="Old Standard TT" w:hAnsi="Old Standard TT"/>
-        </w:rPr>
-        <w:t xml:space="preserve">[S29] FERC. 2003. Order to Show Cause, Reliant Energy Services and BP Energy. 68 Fed. Reg. 15716. </w:t>
-      </w:r>
-      <w:hyperlink r:id="rId26">
-        <w:r>
-          <w:rPr>
-            <w:rFonts w:ascii="Old Standard TT" w:cs="Old Standard TT" w:eastAsia="Old Standard TT" w:hAnsi="Old Standard TT"/>
-            <w:color w:val="1155cc"/>
-            <w:u w:val="single"/>
-          </w:rPr>
-          <w:t xml:space="preserve">https://www.govinfo.gov/content/pkg/FR-2003-04-01/pdf/03-7797.pdf</w:t>
-        </w:r>
-      </w:hyperlink>
+          <w:b/>
+          <w:bCs/>
+        </w:rPr>
+        <w:t xml:space="preserve">The positive control is scripted.</w:t>
+      </w:r>
+      <w:r>
+        <w:rPr>
+          <w:rFonts w:ascii="Old Standard TT" w:cs="Old Standard TT" w:eastAsia="Old Standard TT" w:hAnsi="Old Standard TT"/>
+        </w:rPr>
+        <w:t xml:space="preserve"> P proves that the auditors work. It does not show how language-model coalitions behave.</w:t>
+      </w:r>
     </w:p>
     <w:p>
       <w:pPr>
@@ -14706,19 +15190,17 @@
       <w:r>
         <w:rPr>
           <w:rFonts w:ascii="Old Standard TT" w:cs="Old Standard TT" w:eastAsia="Old Standard TT" w:hAnsi="Old Standard TT"/>
-        </w:rPr>
-        <w:t xml:space="preserve">[S30] FERC. 2003. Order to Show Cause, Enron partnerships. 68 Fed. Reg. 39921. </w:t>
-      </w:r>
-      <w:hyperlink r:id="rId27">
-        <w:r>
-          <w:rPr>
-            <w:rFonts w:ascii="Old Standard TT" w:cs="Old Standard TT" w:eastAsia="Old Standard TT" w:hAnsi="Old Standard TT"/>
-            <w:color w:val="1155cc"/>
-            <w:u w:val="single"/>
-          </w:rPr>
-          <w:t xml:space="preserve">https://www.govinfo.gov/content/pkg/FR-2003-07-03/pdf/03-16822.pdf</w:t>
-        </w:r>
-      </w:hyperlink>
+          <w:b/>
+          <w:bCs/>
+        </w:rPr>
+        <w:t xml:space="preserve">The coordination had nothing to change in the main game.</w:t>
+      </w:r>
+      <w:r>
+        <w:rPr>
+          <w:rFonts w:ascii="Old Standard TT" w:cs="Old Standard TT" w:eastAsia="Old Standard TT" w:hAnsi="Old Standard TT"/>
+        </w:rPr>
+        <w:t xml:space="preserve"> In regimes A to P, endorsing is a weakly dominant strategy for an approval-seeking reviewer. The main game cannot show a positive communication effect for agents that follow their payoffs. Section 4.6 removes this limit for one round.</w:t>
+      </w:r>
     </w:p>
     <w:p>
       <w:pPr>
@@ -14735,19 +15217,30 @@
       <w:r>
         <w:rPr>
           <w:rFonts w:ascii="Old Standard TT" w:cs="Old Standard TT" w:eastAsia="Old Standard TT" w:hAnsi="Old Standard TT"/>
-        </w:rPr>
-        <w:t xml:space="preserve">[S34] National Transportation Safety Board. 2011. Pacific Gas and Electric Company Natural Gas Transmission Pipeline Rupture and Fire, San Bruno, California, September 9, 2010. Pipeline Accident Report NTSB/PAR-11/01. </w:t>
-      </w:r>
-      <w:hyperlink r:id="rId28">
-        <w:r>
-          <w:rPr>
-            <w:rFonts w:ascii="Old Standard TT" w:cs="Old Standard TT" w:eastAsia="Old Standard TT" w:hAnsi="Old Standard TT"/>
-            <w:color w:val="1155cc"/>
-            <w:u w:val="single"/>
-          </w:rPr>
-          <w:t xml:space="preserve">https://www.ntsb.gov/investigations/AccidentReports/Reports/PAR1101.pdf</w:t>
-        </w:r>
-      </w:hyperlink>
+          <w:b/>
+          <w:bCs/>
+        </w:rPr>
+        <w:t xml:space="preserve">The real cases are analogies.</w:t>
+      </w:r>
+      <w:r>
+        <w:rPr>
+          <w:rFonts w:ascii="Old Standard TT" w:cs="Old Standard TT" w:eastAsia="Old Standard TT" w:hAnsi="Old Standard TT"/>
+        </w:rPr>
+        <w:t xml:space="preserve"> Real investigators used sworn answers, recorded calls, and inspections. My auditor reads one trajectory. The cases in Section 1.3 motivate the features. They do not validate them. Eturas presumes participation once awareness is shown </w:t>
+      </w:r>
+      <w:r>
+        <w:rPr>
+          <w:rFonts w:ascii="Old Standard TT" w:cs="Old Standard TT" w:eastAsia="Old Standard TT" w:hAnsi="Old Standard TT"/>
+          <w:vertAlign w:val="superscript"/>
+        </w:rPr>
+        <w:t xml:space="preserve">7</w:t>
+      </w:r>
+      <w:r>
+        <w:rPr>
+          <w:rFonts w:ascii="Old Standard TT" w:cs="Old Standard TT" w:eastAsia="Old Standard TT" w:hAnsi="Old Standard TT"/>
+        </w:rPr>
+        <w:t xml:space="preserve">; regime F is labeled non-collusion by construction.</w:t>
+      </w:r>
     </w:p>
     <w:p>
       <w:pPr>
@@ -14764,33 +15257,17 @@
       <w:r>
         <w:rPr>
           <w:rFonts w:ascii="Old Standard TT" w:cs="Old Standard TT" w:eastAsia="Old Standard TT" w:hAnsi="Old Standard TT"/>
-        </w:rPr>
-        <w:t xml:space="preserve">[S40] </w:t>
-      </w:r>
-      <w:r>
-        <w:rPr>
-          <w:rFonts w:ascii="Old Standard TT" w:cs="Old Standard TT" w:eastAsia="Old Standard TT" w:hAnsi="Old Standard TT"/>
-          <w:i/>
-          <w:iCs/>
-        </w:rPr>
-        <w:t xml:space="preserve">Bell Atlantic Corp. v. Twombly</w:t>
-      </w:r>
-      <w:r>
-        <w:rPr>
-          <w:rFonts w:ascii="Old Standard TT" w:cs="Old Standard TT" w:eastAsia="Old Standard TT" w:hAnsi="Old Standard TT"/>
-        </w:rPr>
-        <w:t xml:space="preserve">, 550 U.S. 544 (2007). </w:t>
-      </w:r>
-      <w:hyperlink r:id="rId29">
-        <w:r>
-          <w:rPr>
-            <w:rFonts w:ascii="Old Standard TT" w:cs="Old Standard TT" w:eastAsia="Old Standard TT" w:hAnsi="Old Standard TT"/>
-            <w:color w:val="1155cc"/>
-            <w:u w:val="single"/>
-          </w:rPr>
-          <w:t xml:space="preserve">https://www.law.cornell.edu/supct/html/05-1126.ZO.html</w:t>
-        </w:r>
-      </w:hyperlink>
+          <w:b/>
+          <w:bCs/>
+        </w:rPr>
+        <w:t xml:space="preserve">The shared-origin feature is coarse.</w:t>
+      </w:r>
+      <w:r>
+        <w:rPr>
+          <w:rFonts w:ascii="Old Standard TT" w:cs="Old Standard TT" w:eastAsia="Old Standard TT" w:hAnsi="Old Standard TT"/>
+        </w:rPr>
+        <w:t xml:space="preserve"> It counts a pair of citations as sharing an origin when both reviewers cite the same item. So it is high whenever the reviewers cite the same items, with or without a shared source.</w:t>
+      </w:r>
     </w:p>
     <w:p>
       <w:pPr>
@@ -14807,33 +15284,42 @@
       <w:r>
         <w:rPr>
           <w:rFonts w:ascii="Old Standard TT" w:cs="Old Standard TT" w:eastAsia="Old Standard TT" w:hAnsi="Old Standard TT"/>
-        </w:rPr>
-        <w:t xml:space="preserve">[S41] </w:t>
-      </w:r>
-      <w:r>
-        <w:rPr>
-          <w:rFonts w:ascii="Old Standard TT" w:cs="Old Standard TT" w:eastAsia="Old Standard TT" w:hAnsi="Old Standard TT"/>
-          <w:i/>
-          <w:iCs/>
-        </w:rPr>
-        <w:t xml:space="preserve">Interstate Circuit, Inc. v. United States</w:t>
-      </w:r>
-      <w:r>
-        <w:rPr>
-          <w:rFonts w:ascii="Old Standard TT" w:cs="Old Standard TT" w:eastAsia="Old Standard TT" w:hAnsi="Old Standard TT"/>
-        </w:rPr>
-        <w:t xml:space="preserve">, 306 U.S. 208 (1939). </w:t>
-      </w:r>
-      <w:hyperlink r:id="rId30">
-        <w:r>
-          <w:rPr>
-            <w:rFonts w:ascii="Old Standard TT" w:cs="Old Standard TT" w:eastAsia="Old Standard TT" w:hAnsi="Old Standard TT"/>
-            <w:color w:val="1155cc"/>
-            <w:u w:val="single"/>
-          </w:rPr>
-          <w:t xml:space="preserve">https://www.law.cornell.edu/supremecourt/text/306/208</w:t>
-        </w:r>
-      </w:hyperlink>
+          <w:b/>
+          <w:bCs/>
+        </w:rPr>
+        <w:t xml:space="preserve">Payoff data identifies the regime.</w:t>
+      </w:r>
+      <w:r>
+        <w:rPr>
+          <w:rFonts w:ascii="Old Standard TT" w:cs="Old Standard TT" w:eastAsia="Old Standard TT" w:hAnsi="Old Standard TT"/>
+        </w:rPr>
+        <w:t xml:space="preserve"> S4 is only an upper limit. S4d also uses a matched trajectory that a deployer cannot make.</w:t>
+      </w:r>
+    </w:p>
+    <w:p>
+      <w:pPr>
+        <w:pStyle w:val="Heading3"/>
+        <w:spacing w:before="200" w:lineRule="auto"/>
+        <w:rPr>
+          <w:rFonts w:ascii="Old Standard TT" w:cs="Old Standard TT" w:eastAsia="Old Standard TT" w:hAnsi="Old Standard TT"/>
+          <w:b/>
+          <w:bCs/>
+          <w:color w:val="000000"/>
+          <w:sz w:val="26"/>
+          <w:szCs w:val="26"/>
+        </w:rPr>
+      </w:pPr>
+      <w:r>
+        <w:rPr>
+          <w:rFonts w:ascii="Old Standard TT" w:cs="Old Standard TT" w:eastAsia="Old Standard TT" w:hAnsi="Old Standard TT"/>
+          <w:b/>
+          <w:bCs/>
+          <w:color w:val="000000"/>
+          <w:sz w:val="26"/>
+          <w:szCs w:val="26"/>
+        </w:rPr>
+        <w:t xml:space="preserve">Dual use and ethics</w:t>
+      </w:r>
     </w:p>
     <w:p>
       <w:pPr>
@@ -14850,33 +15336,17 @@
       <w:r>
         <w:rPr>
           <w:rFonts w:ascii="Old Standard TT" w:cs="Old Standard TT" w:eastAsia="Old Standard TT" w:hAnsi="Old Standard TT"/>
-        </w:rPr>
-        <w:t xml:space="preserve">[S42] Court of Justice of the European Union. 2016-01-21. </w:t>
-      </w:r>
-      <w:r>
-        <w:rPr>
-          <w:rFonts w:ascii="Old Standard TT" w:cs="Old Standard TT" w:eastAsia="Old Standard TT" w:hAnsi="Old Standard TT"/>
-          <w:i/>
-          <w:iCs/>
-        </w:rPr>
-        <w:t xml:space="preserve">Eturas and Others</w:t>
-      </w:r>
-      <w:r>
-        <w:rPr>
-          <w:rFonts w:ascii="Old Standard TT" w:cs="Old Standard TT" w:eastAsia="Old Standard TT" w:hAnsi="Old Standard TT"/>
-        </w:rPr>
-        <w:t xml:space="preserve">, Case C-74/14, CELEX 62014CJ0074. </w:t>
-      </w:r>
-      <w:hyperlink r:id="rId31">
-        <w:r>
-          <w:rPr>
-            <w:rFonts w:ascii="Old Standard TT" w:cs="Old Standard TT" w:eastAsia="Old Standard TT" w:hAnsi="Old Standard TT"/>
-            <w:color w:val="1155cc"/>
-            <w:u w:val="single"/>
-          </w:rPr>
-          <w:t xml:space="preserve">https://eur-lex.europa.eu/legal-content/EN/TXT/?uri=CELEX:62014CJ0074</w:t>
-        </w:r>
-      </w:hyperlink>
+          <w:b/>
+          <w:bCs/>
+        </w:rPr>
+        <w:t xml:space="preserve">Could this make collusion easier or harder to detect?</w:t>
+      </w:r>
+      <w:r>
+        <w:rPr>
+          <w:rFonts w:ascii="Old Standard TT" w:cs="Old Standard TT" w:eastAsia="Old Standard TT" w:hAnsi="Old Standard TT"/>
+        </w:rPr>
+        <w:t xml:space="preserve"> Two findings could help a coalition. A written refusal lowered the language-model judge's score, so a coalition that refuses in writing and endorses anyway evades that judge. The keyword auditor missed reworded plans. Both are weaknesses of the auditors, and both are already known failure modes of text monitors. I report them because a standard of evidence that rests on words would fail in exactly this way. The list of plus factors also tells a coalition what to avoid. But the features are structural (provenance, exposure order, incentives), and antitrust law already names them.</w:t>
+      </w:r>
     </w:p>
     <w:p>
       <w:pPr>
@@ -14894,32 +15364,8 @@
         <w:rPr>
           <w:rFonts w:ascii="Old Standard TT" w:cs="Old Standard TT" w:eastAsia="Old Standard TT" w:hAnsi="Old Standard TT"/>
         </w:rPr>
-        <w:t xml:space="preserve">[S46] </w:t>
-      </w:r>
-      <w:r>
-        <w:rPr>
-          <w:rFonts w:ascii="Old Standard TT" w:cs="Old Standard TT" w:eastAsia="Old Standard TT" w:hAnsi="Old Standard TT"/>
-          <w:i/>
-          <w:iCs/>
-        </w:rPr>
-        <w:t xml:space="preserve">Gibson v. Cendyn Group, LLC</w:t>
-      </w:r>
-      <w:r>
-        <w:rPr>
-          <w:rFonts w:ascii="Old Standard TT" w:cs="Old Standard TT" w:eastAsia="Old Standard TT" w:hAnsi="Old Standard TT"/>
-        </w:rPr>
-        <w:t xml:space="preserve">, No. 24-3576 (9th Cir. 2025-08-15). </w:t>
-      </w:r>
-      <w:hyperlink r:id="rId32">
-        <w:r>
-          <w:rPr>
-            <w:rFonts w:ascii="Old Standard TT" w:cs="Old Standard TT" w:eastAsia="Old Standard TT" w:hAnsi="Old Standard TT"/>
-            <w:color w:val="1155cc"/>
-            <w:u w:val="single"/>
-          </w:rPr>
-          <w:t xml:space="preserve">https://cdn.ca9.uscourts.gov/datastore/opinions/2025/08/15/24-3576.pdf</w:t>
-        </w:r>
-      </w:hyperlink>
+        <w:t xml:space="preserve">The prompts ask models to play approval-seeking roles. The models produced biasing plans in a fictional setting. I publish the prompts so that others can test refusals. I add no new capability.</w:t>
+      </w:r>
     </w:p>
     <w:p>
       <w:pPr>
@@ -14937,18 +15383,8 @@
         <w:rPr>
           <w:rFonts w:ascii="Old Standard TT" w:cs="Old Standard TT" w:eastAsia="Old Standard TT" w:hAnsi="Old Standard TT"/>
         </w:rPr>
-        <w:t xml:space="preserve">[W3] Apart Research. 2026. AI Collusion Research Sprint page. </w:t>
-      </w:r>
-      <w:hyperlink r:id="rId33">
-        <w:r>
-          <w:rPr>
-            <w:rFonts w:ascii="Old Standard TT" w:cs="Old Standard TT" w:eastAsia="Old Standard TT" w:hAnsi="Old Standard TT"/>
-            <w:color w:val="1155cc"/>
-            <w:u w:val="single"/>
-          </w:rPr>
-          <w:t xml:space="preserve">https://apartresearch.com/sprints/ai-collusion-research-sprint-2026-10-23-to-2026-10-25</w:t>
-        </w:r>
-      </w:hyperlink>
+        <w:t xml:space="preserve">I model no real organizations, persons, or markets. All cases are fictional. No human subjects took part.</w:t>
+      </w:r>
     </w:p>
     <w:p>
       <w:pPr>
@@ -14970,93 +15406,7 @@
           <w:sz w:val="28"/>
           <w:szCs w:val="28"/>
         </w:rPr>
-        <w:t xml:space="preserve">Appendix A. Limitations and Dual-Use / Ethical Considerations</w:t>
-      </w:r>
-    </w:p>
-    <w:p>
-      <w:pPr>
-        <w:pStyle w:val="Heading3"/>
-        <w:spacing w:before="200" w:lineRule="auto"/>
-        <w:rPr>
-          <w:rFonts w:ascii="Old Standard TT" w:cs="Old Standard TT" w:eastAsia="Old Standard TT" w:hAnsi="Old Standard TT"/>
-          <w:b/>
-          <w:bCs/>
-          <w:color w:val="000000"/>
-          <w:sz w:val="26"/>
-          <w:szCs w:val="26"/>
-        </w:rPr>
-      </w:pPr>
-      <w:r>
-        <w:rPr>
-          <w:rFonts w:ascii="Old Standard TT" w:cs="Old Standard TT" w:eastAsia="Old Standard TT" w:hAnsi="Old Standard TT"/>
-          <w:b/>
-          <w:bCs/>
-          <w:color w:val="000000"/>
-          <w:sz w:val="26"/>
-          <w:szCs w:val="26"/>
-        </w:rPr>
-        <w:t xml:space="preserve">What this result does and does not establish</w:t>
-      </w:r>
-    </w:p>
-    <w:p>
-      <w:pPr>
-        <w:spacing w:after="120"/>
-        <w:rPr>
-          <w:rFonts w:ascii="Old Standard TT" w:cs="Old Standard TT" w:eastAsia="Old Standard TT" w:hAnsi="Old Standard TT"/>
-        </w:rPr>
-      </w:pPr>
-      <w:r>
-        <w:rPr>
-          <w:rFonts w:ascii="Old Standard TT" w:cs="Old Standard TT" w:eastAsia="Old Standard TT" w:hAnsi="Old Standard TT"/>
-          <w:b/>
-          <w:bCs/>
-        </w:rPr>
-        <w:t xml:space="preserve">It establishes</w:t>
-      </w:r>
-      <w:r>
-        <w:rPr>
-          <w:rFonts w:ascii="Old Standard TT" w:cs="Old Standard TT" w:eastAsia="Old Standard TT" w:hAnsi="Old Standard TT"/>
-        </w:rPr>
-        <w:t xml:space="preserve"> four things, for seven language models under one set of role prompts. A private channel did not raise the rate of false approvals. Written agreement and refusal did not predict endorsements. Provenance discounts had almost no false positives to remove. Two language-model judges disagree about which records show collusion. </w:t>
-      </w:r>
-      <w:r>
-        <w:rPr>
-          <w:rFonts w:ascii="Old Standard TT" w:cs="Old Standard TT" w:eastAsia="Old Standard TT" w:hAnsi="Old Standard TT"/>
-          <w:b/>
-          <w:bCs/>
-        </w:rPr>
-        <w:t xml:space="preserve">It does not establish</w:t>
-      </w:r>
-      <w:r>
-        <w:rPr>
-          <w:rFonts w:ascii="Old Standard TT" w:cs="Old Standard TT" w:eastAsia="Old Standard TT" w:hAnsi="Old Standard TT"/>
-        </w:rPr>
-        <w:t xml:space="preserve"> how models with trained goals would act. It does not show how the same models act under other prompts. It does not show whether any auditor can detect a coalition that coordinates without text. The one real case was caught only with a twin record that no deployed auditor has.</w:t>
-      </w:r>
-    </w:p>
-    <w:p>
-      <w:pPr>
-        <w:pStyle w:val="Heading3"/>
-        <w:spacing w:before="200" w:lineRule="auto"/>
-        <w:rPr>
-          <w:rFonts w:ascii="Old Standard TT" w:cs="Old Standard TT" w:eastAsia="Old Standard TT" w:hAnsi="Old Standard TT"/>
-          <w:b/>
-          <w:bCs/>
-          <w:color w:val="000000"/>
-          <w:sz w:val="26"/>
-          <w:szCs w:val="26"/>
-        </w:rPr>
-      </w:pPr>
-      <w:r>
-        <w:rPr>
-          <w:rFonts w:ascii="Old Standard TT" w:cs="Old Standard TT" w:eastAsia="Old Standard TT" w:hAnsi="Old Standard TT"/>
-          <w:b/>
-          <w:bCs/>
-          <w:color w:val="000000"/>
-          <w:sz w:val="26"/>
-          <w:szCs w:val="26"/>
-        </w:rPr>
-        <w:t xml:space="preserve">Limitations</w:t>
+        <w:t xml:space="preserve">Appendix B. Preexisting work and LLM usage statement</w:t>
       </w:r>
     </w:p>
     <w:p>
@@ -15077,13 +15427,13 @@
           <w:b/>
           <w:bCs/>
         </w:rPr>
-        <w:t xml:space="preserve">Prompt-conditioned behavior.</w:t>
-      </w:r>
-      <w:r>
-        <w:rPr>
-          <w:rFonts w:ascii="Old Standard TT" w:cs="Old Standard TT" w:eastAsia="Old Standard TT" w:hAnsi="Old Standard TT"/>
-        </w:rPr>
-        <w:t xml:space="preserve"> The prompts state the payoffs. The results show how seven models behave under these role prompts. They do not show learned objectives.</w:t>
+        <w:t xml:space="preserve">Before the sprint.</w:t>
+      </w:r>
+      <w:r>
+        <w:rPr>
+          <w:rFonts w:ascii="Old Standard TT" w:cs="Old Standard TT" w:eastAsia="Old Standard TT" w:hAnsi="Old Standard TT"/>
+        </w:rPr>
+        <w:t xml:space="preserve"> I worked out the research question and the framework in the week before the sprint, as notes. The framework was the review game, the eight settings, the five causes of agreement, the plus-factor idea, and the reading list. No code, prompts, runs, or results existed before the sprint.</w:t>
       </w:r>
     </w:p>
     <w:p>
@@ -15104,13 +15454,27 @@
           <w:b/>
           <w:bCs/>
         </w:rPr>
-        <w:t xml:space="preserve">One prompt set and one game.</w:t>
-      </w:r>
-      <w:r>
-        <w:rPr>
-          <w:rFonts w:ascii="Old Standard TT" w:cs="Old Standard TT" w:eastAsia="Old Standard TT" w:hAnsi="Old Standard TT"/>
-        </w:rPr>
-        <w:t xml:space="preserve"> I used one set of prompts, one game, and 24 fictional cases. Other prompts can give different results.</w:t>
+        <w:t xml:space="preserve">During the sprint.</w:t>
+      </w:r>
+      <w:r>
+        <w:rPr>
+          <w:rFonts w:ascii="Old Standard TT" w:cs="Old Standard TT" w:eastAsia="Old Standard TT" w:hAnsi="Old Standard TT"/>
+        </w:rPr>
+        <w:t xml:space="preserve"> Everything reported here: the code in </w:t>
+      </w:r>
+      <w:r>
+        <w:rPr>
+          <w:rFonts w:ascii="Courier New" w:cs="Courier New" w:eastAsia="Courier New" w:hAnsi="Courier New"/>
+          <w:sz w:val="19"/>
+          <w:szCs w:val="19"/>
+        </w:rPr>
+        <w:t xml:space="preserve">lab/</w:t>
+      </w:r>
+      <w:r>
+        <w:rPr>
+          <w:rFonts w:ascii="Old Standard TT" w:cs="Old Standard TT" w:eastAsia="Old Standard TT" w:hAnsi="Old Standard TT"/>
+        </w:rPr>
+        <w:t xml:space="preserve">, the preregistration, all runs, the hand classification, the analysis scripts, the figures, and this report. The README of the repository says the same.</w:t>
       </w:r>
     </w:p>
     <w:p>
@@ -15131,444 +15495,13 @@
           <w:b/>
           <w:bCs/>
         </w:rPr>
-        <w:t xml:space="preserve">Small samples.</w:t>
-      </w:r>
-      <w:r>
-        <w:rPr>
-          <w:rFonts w:ascii="Old Standard TT" w:cs="Old Standard TT" w:eastAsia="Old Standard TT" w:hAnsi="Old Standard TT"/>
-        </w:rPr>
-        <w:t xml:space="preserve"> Each false approval rate uses 18 false-claim trajectories. The intervals are wide.</w:t>
-      </w:r>
-    </w:p>
-    <w:p>
-      <w:pPr>
-        <w:numPr>
-          <w:ilvl w:val="0"/>
-          <w:numId w:val="3"/>
-        </w:numPr>
-        <w:spacing w:after="60"/>
-        <w:ind w:left="720" w:hanging="360"/>
-        <w:rPr>
-          <w:rFonts w:ascii="Old Standard TT" w:cs="Old Standard TT" w:eastAsia="Old Standard TT" w:hAnsi="Old Standard TT"/>
-        </w:rPr>
-      </w:pPr>
-      <w:r>
-        <w:rPr>
-          <w:rFonts w:ascii="Old Standard TT" w:cs="Old Standard TT" w:eastAsia="Old Standard TT" w:hAnsi="Old Standard TT"/>
-          <w:b/>
-          <w:bCs/>
-        </w:rPr>
-        <w:t xml:space="preserve">Seeds are not fully independent.</w:t>
-      </w:r>
-      <w:r>
-        <w:rPr>
-          <w:rFonts w:ascii="Old Standard TT" w:cs="Old Standard TT" w:eastAsia="Old Standard TT" w:hAnsi="Old Standard TT"/>
-        </w:rPr>
-        <w:t xml:space="preserve"> About one call in six came from the local cache, because two seeds gave an identical prompt. Some seeds repeat earlier answers.</w:t>
-      </w:r>
-    </w:p>
-    <w:p>
-      <w:pPr>
-        <w:numPr>
-          <w:ilvl w:val="0"/>
-          <w:numId w:val="3"/>
-        </w:numPr>
-        <w:spacing w:after="60"/>
-        <w:ind w:left="720" w:hanging="360"/>
-        <w:rPr>
-          <w:rFonts w:ascii="Old Standard TT" w:cs="Old Standard TT" w:eastAsia="Old Standard TT" w:hAnsi="Old Standard TT"/>
-        </w:rPr>
-      </w:pPr>
-      <w:r>
-        <w:rPr>
-          <w:rFonts w:ascii="Old Standard TT" w:cs="Old Standard TT" w:eastAsia="Old Standard TT" w:hAnsi="Old Standard TT"/>
-          <w:b/>
-          <w:bCs/>
-        </w:rPr>
-        <w:t xml:space="preserve">Six models are exploratory.</w:t>
-      </w:r>
-      <w:r>
-        <w:rPr>
-          <w:rFonts w:ascii="Old Standard TT" w:cs="Old Standard TT" w:eastAsia="Old Standard TT" w:hAnsi="Old Standard TT"/>
-        </w:rPr>
-        <w:t xml:space="preserve"> I added them after I saw the DeepSeek chat results. They use a reply limit of 1,500 tokens; DeepSeek chat uses 600. The two DeepSeek V4 models run with thinking disabled. Twenty trajectories failed on network errors, and I ran them again with identical prompts (Appendix C).</w:t>
-      </w:r>
-    </w:p>
-    <w:p>
-      <w:pPr>
-        <w:numPr>
-          <w:ilvl w:val="0"/>
-          <w:numId w:val="3"/>
-        </w:numPr>
-        <w:spacing w:after="60"/>
-        <w:ind w:left="720" w:hanging="360"/>
-        <w:rPr>
-          <w:rFonts w:ascii="Old Standard TT" w:cs="Old Standard TT" w:eastAsia="Old Standard TT" w:hAnsi="Old Standard TT"/>
-        </w:rPr>
-      </w:pPr>
-      <w:r>
-        <w:rPr>
-          <w:rFonts w:ascii="Old Standard TT" w:cs="Old Standard TT" w:eastAsia="Old Standard TT" w:hAnsi="Old Standard TT"/>
-          <w:b/>
-          <w:bCs/>
-        </w:rPr>
-        <w:t xml:space="preserve">The hand classification is limited.</w:t>
-      </w:r>
-      <w:r>
-        <w:rPr>
-          <w:rFonts w:ascii="Old Standard TT" w:cs="Old Standard TT" w:eastAsia="Old Standard TT" w:hAnsi="Old Standard TT"/>
-        </w:rPr>
-        <w:t xml:space="preserve"> The AI assistant classified the E1 trajectories of DeepSeek chat, GPT-5.6 Terra, and DeepSeek Flash. Claude Sonnet and DeepSeek V4 Pro sent no private messages. The assistant read Claude Haiku's 3 messages; I did not classify GPT-5.6 Luna's 36. I spot-checked the tables. </w:t>
-      </w:r>
-      <w:r>
-        <w:rPr>
-          <w:rFonts w:ascii="Old Standard TT" w:cs="Old Standard TT" w:eastAsia="Old Standard TT" w:hAnsi="Old Standard TT"/>
-          <w:highlight w:val="yellow"/>
-        </w:rPr>
-        <w:t xml:space="preserve">[AUTHOR:</w:t>
-      </w:r>
-      <w:r>
-        <w:rPr>
-          <w:rFonts w:ascii="Old Standard TT" w:cs="Old Standard TT" w:eastAsia="Old Standard TT" w:hAnsi="Old Standard TT"/>
-          <w:highlight w:val="yellow"/>
-        </w:rPr>
-        <w:t xml:space="preserve"> confirm after your spot-check.</w:t>
-      </w:r>
-      <w:r>
-        <w:rPr>
-          <w:rFonts w:ascii="Old Standard TT" w:cs="Old Standard TT" w:eastAsia="Old Standard TT" w:hAnsi="Old Standard TT"/>
-          <w:highlight w:val="yellow"/>
-        </w:rPr>
-        <w:t xml:space="preserve">]</w:t>
-      </w:r>
-    </w:p>
-    <w:p>
-      <w:pPr>
-        <w:numPr>
-          <w:ilvl w:val="0"/>
-          <w:numId w:val="3"/>
-        </w:numPr>
-        <w:spacing w:after="60"/>
-        <w:ind w:left="720" w:hanging="360"/>
-        <w:rPr>
-          <w:rFonts w:ascii="Old Standard TT" w:cs="Old Standard TT" w:eastAsia="Old Standard TT" w:hAnsi="Old Standard TT"/>
-        </w:rPr>
-      </w:pPr>
-      <w:r>
-        <w:rPr>
-          <w:rFonts w:ascii="Old Standard TT" w:cs="Old Standard TT" w:eastAsia="Old Standard TT" w:hAnsi="Old Standard TT"/>
-          <w:b/>
-          <w:bCs/>
-        </w:rPr>
-        <w:t xml:space="preserve">The keyword rule is weak.</w:t>
-      </w:r>
-      <w:r>
-        <w:rPr>
-          <w:rFonts w:ascii="Old Standard TT" w:cs="Old Standard TT" w:eastAsia="Old Standard TT" w:hAnsi="Old Standard TT"/>
-        </w:rPr>
-        <w:t xml:space="preserve"> It finds the scripted plan but misses reworded plans. The LLM judge is a complement, with its own biases.</w:t>
-      </w:r>
-    </w:p>
-    <w:p>
-      <w:pPr>
-        <w:numPr>
-          <w:ilvl w:val="0"/>
-          <w:numId w:val="3"/>
-        </w:numPr>
-        <w:spacing w:after="60"/>
-        <w:ind w:left="720" w:hanging="360"/>
-        <w:rPr>
-          <w:rFonts w:ascii="Old Standard TT" w:cs="Old Standard TT" w:eastAsia="Old Standard TT" w:hAnsi="Old Standard TT"/>
-        </w:rPr>
-      </w:pPr>
-      <w:r>
-        <w:rPr>
-          <w:rFonts w:ascii="Old Standard TT" w:cs="Old Standard TT" w:eastAsia="Old Standard TT" w:hAnsi="Old Standard TT"/>
-          <w:b/>
-          <w:bCs/>
-        </w:rPr>
-        <w:t xml:space="preserve">The positive control is scripted.</w:t>
-      </w:r>
-      <w:r>
-        <w:rPr>
-          <w:rFonts w:ascii="Old Standard TT" w:cs="Old Standard TT" w:eastAsia="Old Standard TT" w:hAnsi="Old Standard TT"/>
-        </w:rPr>
-        <w:t xml:space="preserve"> P proves that the auditors work. It does not show how language-model coalitions behave.</w:t>
-      </w:r>
-    </w:p>
-    <w:p>
-      <w:pPr>
-        <w:numPr>
-          <w:ilvl w:val="0"/>
-          <w:numId w:val="3"/>
-        </w:numPr>
-        <w:spacing w:after="60"/>
-        <w:ind w:left="720" w:hanging="360"/>
-        <w:rPr>
-          <w:rFonts w:ascii="Old Standard TT" w:cs="Old Standard TT" w:eastAsia="Old Standard TT" w:hAnsi="Old Standard TT"/>
-        </w:rPr>
-      </w:pPr>
-      <w:r>
-        <w:rPr>
-          <w:rFonts w:ascii="Old Standard TT" w:cs="Old Standard TT" w:eastAsia="Old Standard TT" w:hAnsi="Old Standard TT"/>
-          <w:b/>
-          <w:bCs/>
-        </w:rPr>
-        <w:t xml:space="preserve">The coordination had nothing to change in the main game.</w:t>
-      </w:r>
-      <w:r>
-        <w:rPr>
-          <w:rFonts w:ascii="Old Standard TT" w:cs="Old Standard TT" w:eastAsia="Old Standard TT" w:hAnsi="Old Standard TT"/>
-        </w:rPr>
-        <w:t xml:space="preserve"> In regimes A to P, endorsing is a weakly dominant strategy for an approval-seeking reviewer. The main game cannot show a positive communication effect for agents that follow their payoffs. Section 4.6 removes this limit for one round.</w:t>
-      </w:r>
-    </w:p>
-    <w:p>
-      <w:pPr>
-        <w:numPr>
-          <w:ilvl w:val="0"/>
-          <w:numId w:val="3"/>
-        </w:numPr>
-        <w:spacing w:after="60"/>
-        <w:ind w:left="720" w:hanging="360"/>
-        <w:rPr>
-          <w:rFonts w:ascii="Old Standard TT" w:cs="Old Standard TT" w:eastAsia="Old Standard TT" w:hAnsi="Old Standard TT"/>
-        </w:rPr>
-      </w:pPr>
-      <w:r>
-        <w:rPr>
-          <w:rFonts w:ascii="Old Standard TT" w:cs="Old Standard TT" w:eastAsia="Old Standard TT" w:hAnsi="Old Standard TT"/>
-          <w:b/>
-          <w:bCs/>
-        </w:rPr>
-        <w:t xml:space="preserve">The real cases are analogies.</w:t>
-      </w:r>
-      <w:r>
-        <w:rPr>
-          <w:rFonts w:ascii="Old Standard TT" w:cs="Old Standard TT" w:eastAsia="Old Standard TT" w:hAnsi="Old Standard TT"/>
-        </w:rPr>
-        <w:t xml:space="preserve"> Real investigators used sworn answers, recorded calls, and inspections. My auditor reads one trajectory. The cases in Section 1.3 motivate the features. They do not validate them. Eturas presumes participation once awareness is shown [S42]; regime F is labeled non-collusion by construction.</w:t>
-      </w:r>
-    </w:p>
-    <w:p>
-      <w:pPr>
-        <w:numPr>
-          <w:ilvl w:val="0"/>
-          <w:numId w:val="3"/>
-        </w:numPr>
-        <w:spacing w:after="60"/>
-        <w:ind w:left="720" w:hanging="360"/>
-        <w:rPr>
-          <w:rFonts w:ascii="Old Standard TT" w:cs="Old Standard TT" w:eastAsia="Old Standard TT" w:hAnsi="Old Standard TT"/>
-        </w:rPr>
-      </w:pPr>
-      <w:r>
-        <w:rPr>
-          <w:rFonts w:ascii="Old Standard TT" w:cs="Old Standard TT" w:eastAsia="Old Standard TT" w:hAnsi="Old Standard TT"/>
-          <w:b/>
-          <w:bCs/>
-        </w:rPr>
-        <w:t xml:space="preserve">The shared-origin feature is coarse.</w:t>
-      </w:r>
-      <w:r>
-        <w:rPr>
-          <w:rFonts w:ascii="Old Standard TT" w:cs="Old Standard TT" w:eastAsia="Old Standard TT" w:hAnsi="Old Standard TT"/>
-        </w:rPr>
-        <w:t xml:space="preserve"> It counts a pair of citations as sharing an origin when both reviewers cite the same item. So it is high whenever the reviewers cite the same items, with or without a shared source.</w:t>
-      </w:r>
-    </w:p>
-    <w:p>
-      <w:pPr>
-        <w:numPr>
-          <w:ilvl w:val="0"/>
-          <w:numId w:val="3"/>
-        </w:numPr>
-        <w:spacing w:after="60"/>
-        <w:ind w:left="720" w:hanging="360"/>
-        <w:rPr>
-          <w:rFonts w:ascii="Old Standard TT" w:cs="Old Standard TT" w:eastAsia="Old Standard TT" w:hAnsi="Old Standard TT"/>
-        </w:rPr>
-      </w:pPr>
-      <w:r>
-        <w:rPr>
-          <w:rFonts w:ascii="Old Standard TT" w:cs="Old Standard TT" w:eastAsia="Old Standard TT" w:hAnsi="Old Standard TT"/>
-          <w:b/>
-          <w:bCs/>
-        </w:rPr>
-        <w:t xml:space="preserve">Payoff data identifies the regime.</w:t>
-      </w:r>
-      <w:r>
-        <w:rPr>
-          <w:rFonts w:ascii="Old Standard TT" w:cs="Old Standard TT" w:eastAsia="Old Standard TT" w:hAnsi="Old Standard TT"/>
-        </w:rPr>
-        <w:t xml:space="preserve"> S4 is only an upper limit. S4d also uses a matched trajectory that a deployer cannot make.</w:t>
-      </w:r>
-    </w:p>
-    <w:p>
-      <w:pPr>
-        <w:pStyle w:val="Heading3"/>
-        <w:spacing w:before="200" w:lineRule="auto"/>
-        <w:rPr>
-          <w:rFonts w:ascii="Old Standard TT" w:cs="Old Standard TT" w:eastAsia="Old Standard TT" w:hAnsi="Old Standard TT"/>
-          <w:b/>
-          <w:bCs/>
-          <w:color w:val="000000"/>
-          <w:sz w:val="26"/>
-          <w:szCs w:val="26"/>
-        </w:rPr>
-      </w:pPr>
-      <w:r>
-        <w:rPr>
-          <w:rFonts w:ascii="Old Standard TT" w:cs="Old Standard TT" w:eastAsia="Old Standard TT" w:hAnsi="Old Standard TT"/>
-          <w:b/>
-          <w:bCs/>
-          <w:color w:val="000000"/>
-          <w:sz w:val="26"/>
-          <w:szCs w:val="26"/>
-        </w:rPr>
-        <w:t xml:space="preserve">Dual use and ethics</w:t>
-      </w:r>
-    </w:p>
-    <w:p>
-      <w:pPr>
-        <w:numPr>
-          <w:ilvl w:val="0"/>
-          <w:numId w:val="3"/>
-        </w:numPr>
-        <w:spacing w:after="60"/>
-        <w:ind w:left="720" w:hanging="360"/>
-        <w:rPr>
-          <w:rFonts w:ascii="Old Standard TT" w:cs="Old Standard TT" w:eastAsia="Old Standard TT" w:hAnsi="Old Standard TT"/>
-        </w:rPr>
-      </w:pPr>
-      <w:r>
-        <w:rPr>
-          <w:rFonts w:ascii="Old Standard TT" w:cs="Old Standard TT" w:eastAsia="Old Standard TT" w:hAnsi="Old Standard TT"/>
-          <w:b/>
-          <w:bCs/>
-        </w:rPr>
-        <w:t xml:space="preserve">Could this make collusion easier or harder to detect?</w:t>
-      </w:r>
-      <w:r>
-        <w:rPr>
-          <w:rFonts w:ascii="Old Standard TT" w:cs="Old Standard TT" w:eastAsia="Old Standard TT" w:hAnsi="Old Standard TT"/>
-        </w:rPr>
-        <w:t xml:space="preserve"> Two findings could help a coalition. A written refusal lowered the language-model judge's score, so a coalition that refuses in writing and endorses anyway evades that judge. The keyword auditor missed reworded plans. Both are weaknesses of the auditors, and both are already known failure modes of text monitors. I report them because a standard of evidence that rests on words would fail in exactly this way. The list of plus factors also tells a coalition what to avoid. But the features are structural (provenance, exposure order, incentives), and antitrust law already names them.</w:t>
-      </w:r>
-    </w:p>
-    <w:p>
-      <w:pPr>
-        <w:numPr>
-          <w:ilvl w:val="0"/>
-          <w:numId w:val="3"/>
-        </w:numPr>
-        <w:spacing w:after="60"/>
-        <w:ind w:left="720" w:hanging="360"/>
-        <w:rPr>
-          <w:rFonts w:ascii="Old Standard TT" w:cs="Old Standard TT" w:eastAsia="Old Standard TT" w:hAnsi="Old Standard TT"/>
-        </w:rPr>
-      </w:pPr>
-      <w:r>
-        <w:rPr>
-          <w:rFonts w:ascii="Old Standard TT" w:cs="Old Standard TT" w:eastAsia="Old Standard TT" w:hAnsi="Old Standard TT"/>
-        </w:rPr>
-        <w:t xml:space="preserve">The prompts ask models to play approval-seeking roles. The models produced biasing plans in a fictional setting. I publish the prompts so that others can test refusals. I add no new capability.</w:t>
-      </w:r>
-    </w:p>
-    <w:p>
-      <w:pPr>
-        <w:numPr>
-          <w:ilvl w:val="0"/>
-          <w:numId w:val="3"/>
-        </w:numPr>
-        <w:spacing w:after="60"/>
-        <w:ind w:left="720" w:hanging="360"/>
-        <w:rPr>
-          <w:rFonts w:ascii="Old Standard TT" w:cs="Old Standard TT" w:eastAsia="Old Standard TT" w:hAnsi="Old Standard TT"/>
-        </w:rPr>
-      </w:pPr>
-      <w:r>
-        <w:rPr>
-          <w:rFonts w:ascii="Old Standard TT" w:cs="Old Standard TT" w:eastAsia="Old Standard TT" w:hAnsi="Old Standard TT"/>
-        </w:rPr>
-        <w:t xml:space="preserve">I model no real organizations, persons, or markets. All cases are fictional. No human subjects took part.</w:t>
-      </w:r>
-    </w:p>
-    <w:p>
-      <w:pPr>
-        <w:pStyle w:val="Heading2"/>
-        <w:spacing w:after="0" w:before="200" w:line="360" w:lineRule="auto"/>
-        <w:rPr>
-          <w:rFonts w:ascii="Old Standard TT" w:cs="Old Standard TT" w:eastAsia="Old Standard TT" w:hAnsi="Old Standard TT"/>
-          <w:b/>
-          <w:bCs/>
-          <w:sz w:val="28"/>
-          <w:szCs w:val="28"/>
-        </w:rPr>
-      </w:pPr>
-      <w:r>
-        <w:rPr>
-          <w:rFonts w:ascii="Old Standard TT" w:cs="Old Standard TT" w:eastAsia="Old Standard TT" w:hAnsi="Old Standard TT"/>
-          <w:b/>
-          <w:bCs/>
-          <w:sz w:val="28"/>
-          <w:szCs w:val="28"/>
-        </w:rPr>
-        <w:t xml:space="preserve">Appendix B. Preexisting work and LLM usage statement</w:t>
-      </w:r>
-    </w:p>
-    <w:p>
-      <w:pPr>
-        <w:numPr>
-          <w:ilvl w:val="0"/>
-          <w:numId w:val="3"/>
-        </w:numPr>
-        <w:spacing w:after="60"/>
-        <w:ind w:left="720" w:hanging="360"/>
-        <w:rPr>
-          <w:rFonts w:ascii="Old Standard TT" w:cs="Old Standard TT" w:eastAsia="Old Standard TT" w:hAnsi="Old Standard TT"/>
-        </w:rPr>
-      </w:pPr>
-      <w:r>
-        <w:rPr>
-          <w:rFonts w:ascii="Old Standard TT" w:cs="Old Standard TT" w:eastAsia="Old Standard TT" w:hAnsi="Old Standard TT"/>
-          <w:b/>
-          <w:bCs/>
-        </w:rPr>
-        <w:t xml:space="preserve">Before the sprint.</w:t>
-      </w:r>
-      <w:r>
-        <w:rPr>
-          <w:rFonts w:ascii="Old Standard TT" w:cs="Old Standard TT" w:eastAsia="Old Standard TT" w:hAnsi="Old Standard TT"/>
-        </w:rPr>
-        <w:t xml:space="preserve"> I worked out the research question and the framework in the week before the sprint, as notes. The framework was the review game, the eight settings, the five causes of agreement, the plus-factor idea, and the reading list. No code, prompts, runs, or results existed before the sprint.</w:t>
-      </w:r>
-    </w:p>
-    <w:p>
-      <w:pPr>
-        <w:numPr>
-          <w:ilvl w:val="0"/>
-          <w:numId w:val="3"/>
-        </w:numPr>
-        <w:spacing w:after="60"/>
-        <w:ind w:left="720" w:hanging="360"/>
-        <w:rPr>
-          <w:rFonts w:ascii="Old Standard TT" w:cs="Old Standard TT" w:eastAsia="Old Standard TT" w:hAnsi="Old Standard TT"/>
-        </w:rPr>
-      </w:pPr>
-      <w:r>
-        <w:rPr>
-          <w:rFonts w:ascii="Old Standard TT" w:cs="Old Standard TT" w:eastAsia="Old Standard TT" w:hAnsi="Old Standard TT"/>
-          <w:b/>
-          <w:bCs/>
-        </w:rPr>
-        <w:t xml:space="preserve">During the sprint.</w:t>
-      </w:r>
-      <w:r>
-        <w:rPr>
-          <w:rFonts w:ascii="Old Standard TT" w:cs="Old Standard TT" w:eastAsia="Old Standard TT" w:hAnsi="Old Standard TT"/>
-        </w:rPr>
-        <w:t xml:space="preserve"> Everything reported here: the code in </w:t>
+        <w:t xml:space="preserve">LLM usage.</w:t>
+      </w:r>
+      <w:r>
+        <w:rPr>
+          <w:rFonts w:ascii="Old Standard TT" w:cs="Old Standard TT" w:eastAsia="Old Standard TT" w:hAnsi="Old Standard TT"/>
+        </w:rPr>
+        <w:t xml:space="preserve"> I used AI assistants for code, analysis, and text: Claude Code, and ChatGPT for ideas. A background research agent (Claude) found and checked the sources in rows S27 to S46 of the source index (</w:t>
       </w:r>
       <w:r>
         <w:rPr>
@@ -15576,40 +15509,13 @@
           <w:sz w:val="19"/>
           <w:szCs w:val="19"/>
         </w:rPr>
-        <w:t xml:space="preserve">lab/</w:t>
-      </w:r>
-      <w:r>
-        <w:rPr>
-          <w:rFonts w:ascii="Old Standard TT" w:cs="Old Standard TT" w:eastAsia="Old Standard TT" w:hAnsi="Old Standard TT"/>
-        </w:rPr>
-        <w:t xml:space="preserve">, the preregistration, all runs, the hand classification, the analysis scripts, the figures, and this report. The README of the repository says the same.</w:t>
-      </w:r>
-    </w:p>
-    <w:p>
-      <w:pPr>
-        <w:numPr>
-          <w:ilvl w:val="0"/>
-          <w:numId w:val="3"/>
-        </w:numPr>
-        <w:spacing w:after="60"/>
-        <w:ind w:left="720" w:hanging="360"/>
-        <w:rPr>
-          <w:rFonts w:ascii="Old Standard TT" w:cs="Old Standard TT" w:eastAsia="Old Standard TT" w:hAnsi="Old Standard TT"/>
-        </w:rPr>
-      </w:pPr>
-      <w:r>
-        <w:rPr>
-          <w:rFonts w:ascii="Old Standard TT" w:cs="Old Standard TT" w:eastAsia="Old Standard TT" w:hAnsi="Old Standard TT"/>
-          <w:b/>
-          <w:bCs/>
-        </w:rPr>
-        <w:t xml:space="preserve">LLM usage.</w:t>
-      </w:r>
-      <w:r>
-        <w:rPr>
-          <w:rFonts w:ascii="Old Standard TT" w:cs="Old Standard TT" w:eastAsia="Old Standard TT" w:hAnsi="Old Standard TT"/>
-        </w:rPr>
-        <w:t xml:space="preserve"> I used AI assistants for code, analysis, and text: Claude Code, and ChatGPT for ideas. A background research agent (Claude) found and checked the sources [S27] to [S46] and wrote </w:t>
+        <w:t xml:space="preserve">literature/INDEX.md</w:t>
+      </w:r>
+      <w:r>
+        <w:rPr>
+          <w:rFonts w:ascii="Old Standard TT" w:cs="Old Standard TT" w:eastAsia="Old Standard TT" w:hAnsi="Old Standard TT"/>
+        </w:rPr>
+        <w:t xml:space="preserve">) and wrote </w:t>
       </w:r>
       <w:r>
         <w:rPr>
@@ -18738,7 +18644,7 @@
       <w:pPr>
         <w:numPr>
           <w:ilvl w:val="0"/>
-          <w:numId w:val="12"/>
+          <w:numId w:val="13"/>
         </w:numPr>
         <w:spacing w:after="60"/>
         <w:ind w:left="720" w:hanging="360"/>
@@ -18765,7 +18671,7 @@
       <w:pPr>
         <w:numPr>
           <w:ilvl w:val="0"/>
-          <w:numId w:val="12"/>
+          <w:numId w:val="13"/>
         </w:numPr>
         <w:spacing w:after="60"/>
         <w:ind w:left="720" w:hanging="360"/>
@@ -18792,7 +18698,7 @@
       <w:pPr>
         <w:numPr>
           <w:ilvl w:val="0"/>
-          <w:numId w:val="12"/>
+          <w:numId w:val="13"/>
         </w:numPr>
         <w:spacing w:after="60"/>
         <w:ind w:left="720" w:hanging="360"/>
@@ -18819,7 +18725,7 @@
       <w:pPr>
         <w:numPr>
           <w:ilvl w:val="0"/>
-          <w:numId w:val="12"/>
+          <w:numId w:val="13"/>
         </w:numPr>
         <w:spacing w:after="60"/>
         <w:ind w:left="720" w:hanging="360"/>
@@ -25617,6 +25523,12 @@
     </w:lvlOverride>
   </w:num>
   <w:num w:numId="12">
+    <w:abstractNumId w:val="5"/>
+    <w:lvlOverride w:ilvl="0">
+      <w:startOverride w:val="1"/>
+    </w:lvlOverride>
+  </w:num>
+  <w:num w:numId="13">
     <w:abstractNumId w:val="5"/>
     <w:lvlOverride w:ilvl="0">
       <w:startOverride w:val="1"/>

</xml_diff>